<commit_message>
Gaura-ganoddesha-dipika: verified Sanskrit text, word-for-word, 36 translation fixes, full edition
Co-Authored-By: Claude Opus 5.5 <noreply@anthropic.com>
Claude-Session: https://claude.ai/code/session_01KGC2T1PiSRGJe48WTtGST9
</commit_message>
<xml_diff>
--- a/gaura-ganoddesha/Gaura-Ganoddesha-Dipika-ru.docx
+++ b/gaura-ganoddesha/Gaura-Ganoddesha-Dipika-ru.docx
@@ -134,19 +134,65 @@
         <w:br/>
       </w:r>
       <w:r>
-        <w:t>в группы). Места, где извлечённый текст неполон, оговорены в примечаниях.</w:t>
+        <w:t>в группы). Места, где текст требовал пояснений, оговорены в примечаниях.</w:t>
       </w:r>
     </w:p>
     <w:p>
       <w:pPr>
-        <w:pStyle w:val="Heading2"/>
-      </w:pPr>
-      <w:r>
-        <w:t>Оглавление</w:t>
+        <w:spacing w:after="60"/>
+        <w:jc w:val="both"/>
+      </w:pPr>
+      <w:r>
+        <w:rPr>
+          <w:b/>
+          <w:i w:val="0"/>
+        </w:rPr>
+        <w:t>Сверка.</w:t>
+      </w:r>
+      <w:r>
+        <w:t xml:space="preserve"> После первого перевода санскритский текст был выверен: ошибки перекодировки исправлены по метру,</w:t>
+      </w:r>
+      <w:r>
+        <w:br/>
+      </w:r>
+      <w:r>
+        <w:t>грамматике и изображениям страниц издания (так же проверены места, казавшиеся неполными, — почти все они</w:t>
+      </w:r>
+      <w:r>
+        <w:br/>
+      </w:r>
+      <w:r>
+        <w:t>оказались целыми в самом издании). Перевод каждой шлоки заново сверен с выверенным текстом: из 203 шлок и групп</w:t>
+      </w:r>
+      <w:r>
+        <w:br/>
+      </w:r>
+      <w:r>
+        <w:t>167 переведены верно, в 26 внесены мелкие уточнения, в 10 исправлены ошибки — в том числе в отождествлениях</w:t>
+      </w:r>
+      <w:r>
+        <w:br/>
+      </w:r>
+      <w:r>
+        <w:t>(Шанкара Гхош и Шанкара Пандит вместо «Шанкха», Арджуна → гопи Арджунийа, Халаюдха = Прабала, Гунамала =</w:t>
+      </w:r>
+      <w:r>
+        <w:br/>
+      </w:r>
+      <w:r>
+        <w:t>Дамаянти, Васудха и Джахнава = Варуни и Ревати) и в цепочке преемственности Мадхвы (шл. 22).</w:t>
       </w:r>
     </w:p>
     <w:p>
       <w:pPr>
+        <w:pStyle w:val="Heading2"/>
+      </w:pPr>
+      <w:r>
+        <w:t>Оглавление</w:t>
+      </w:r>
+    </w:p>
+    <w:p>
+      <w:pPr>
         <w:spacing w:after="60"/>
         <w:ind w:left="340"/>
       </w:pPr>
@@ -263,7 +309,7 @@
         <w:t>1</w:t>
       </w:r>
       <w:r>
-        <w:t>, луне в роде брахманов, — драгоценному украшению земли, любимцу Владыки: вкусив беседы о сокровенных играх Вриндаваны, что льются из его уст, словно лучи, никто в мире уже ничем иным не радуется.</w:t>
+        <w:t>, луне в роде брахманов, — словно драгоценному украшению земли, любимцу Владыки: вкусив льющиеся из его уст чистые, ничем не замутнённые беседы о сокровенных играх Вриндаваны, никто в мире уже ничем иным не радуется.</w:t>
       </w:r>
     </w:p>
     <w:p>
@@ -429,7 +475,7 @@
         <w:t>11.</w:t>
       </w:r>
       <w:r>
-        <w:t xml:space="preserve"> Смысл этого, раскрытый им, излагаю кратко. Гаурачандра — «преданный по облику», ибо он есть Нандананда. Нитьянанда, который во Врадже был Шри Халаюдхой</w:t>
+        <w:t xml:space="preserve"> Смысл этого, раскрытый им, излагаю кратко. Гаурачандра — «преданный по облику», ибо он есть Нанданандана. Нитьянанда, который во Врадже был Шри Халаюдхой</w:t>
       </w:r>
       <w:r>
         <w:rPr>
@@ -456,7 +502,7 @@
         <w:t>12.</w:t>
       </w:r>
       <w:r>
-        <w:t xml:space="preserve"> Шримад Вишвамбхара, Адвайта и Нитьянанда Авадхута — эти трое здесь почитаются как Виграхи и как Прабху. Единый Махапрабху — это Шри Чайтанья, океан милосердия; два Прабху — прославленные Нитьянанда и Адвайта. Они, а также брахман Гададхара и Шриниваса Пандит, — это Госвами и Виграхи, составляющие панча-таттву.</w:t>
+        <w:t xml:space="preserve"> Шримад Вишвамбхара, Адвайта и Нитьянанда Авадхута — эти трое здесь почитаются как Виграхи и как Прабху. Единый Махапрабху — это Шри Чайтанья, океан милосердия; два Прабху — прославленные Нитьянанда и Адвайта, великие души. Они — Госвами и Виграхи; а вместе с брахманом Гададхарой и Шринивасой Пандитом они составляют панча-таттву.</w:t>
       </w:r>
     </w:p>
     <w:p>
@@ -488,7 +534,7 @@
         <w:t>14.</w:t>
       </w:r>
       <w:r>
-        <w:t xml:space="preserve"> Их спутники, прославленные как «маханты», — все спутники Нитьянанды, пастушки в одежде пастушков; а по связи и близости с ними — лучшие упа-гопалы</w:t>
+        <w:t xml:space="preserve"> Среди их спутников, прославленных как «маханты», все спутники Нитьянанды — гопалы, пастушки в одежде пастушков; а по связи и близости с ними — лучшие упа-гопалы</w:t>
       </w:r>
       <w:r>
         <w:rPr>
@@ -654,7 +700,7 @@
         <w:t>22.</w:t>
       </w:r>
       <w:r>
-        <w:t xml:space="preserve"> Из них здесь подробно описывается сампрадая Мадхвы. Учеником Владыки Паравьомы был Брахма, владыка мира. Его учеником стал Нарада, а учеником Нарады — Вьяса. Шука стал учеником Вьясы, получив от него знание. У того было много учеников и учеников учеников на земле. От Вьясы получил посвящение в мантру Кришны прославленный Мадхвачарья. Он разделил Веды и составил свод «Шатадушани»</w:t>
+        <w:t xml:space="preserve"> Из них здесь подробно описывается сампрадая Мадхвы. Учеником Владыки Паравьомы был Брахма, владыка мира. Его учеником стал Нарада, а учеником Нарады — Вьяса. Шука стал учеником Вьясы, оставив путь (сухого) знания. У того было много учеников и учеников учеников на земле. От Вьясы получил посвящение в мантру Кришны прославленный Мадхвачарья. Разобрав Веды, он составил свод «Шатадушани»</w:t>
       </w:r>
       <w:r>
         <w:rPr>
@@ -665,7 +711,7 @@
         <w:t>7</w:t>
       </w:r>
       <w:r>
-        <w:t>, где учение о Брахмане без качеств очищено учением о Брахмане с качествами. Его учеником был почтенный Падманабхачарья; его учеником — Нарахари, а учеником того — брахман Мадхава. Его учеником был Акшобхья, учеником того — Джаятиртха; его учеником — Джнянасиндху, его учеником — Маханидхи; его учеником — Видьянидхи, его слугой — Раджендра; его учеником — муни Джаядхарма, из круга которого вышел Шримад Вишнупури, автор «Бхакти-ратнавали». Учеником Джаядхармы был преданный брахманам Пурушоттама; его учеником — Вьясатиртха, составивший «Вишну-самхиту»; его учеником — Шримад Лакшмипати, прибежище расы преданности; его учеником — Мадхавендра, которым и введена эта дхарма. Он — воплощение древа желаний, растущего во Врадже и несущего плоды, называемые дружбой, родительской любовью и любовью супружеской</w:t>
+        <w:t>, где Брахман с качествами утверждается в отличие от Брахмана без качеств. Его учеником был почтенный Падманабхачарья; его учеником — Нарахари, а учеником того — брахман Мадхава. Его учеником был Акшобхья, учеником того — Джаятиртха; его учеником — Джнянасиндху, его учеником — Маханидхи; его учеником — Видьянидхи, его слугой — Раджендра; его учеником — муни Джаядхарма, из круга которого вышел Шримад Вишнупури, автор «Бхакти-ратнавали». Учеником Джаядхармы был Пурушоттама, [за ним —] Брахманья; его учеником — Вьясатиртха, составивший «Вишну-самхиту»; его учеником — Шримад Лакшмипати, прибежище расы преданности; его учеником — Мадхавендра, которым и введена эта дхарма. Он — воплощение древа желаний, растущего во Врадже и несущего плоды, называемые служением, дружбой, родительской любовью и любовью супружеской</w:t>
       </w:r>
       <w:r>
         <w:rPr>
@@ -775,7 +821,7 @@
         <w:t>9</w:t>
       </w:r>
       <w:r>
-        <w:t>, который некогда, увидев танец гандхарвов, взволновался умом, вошёл в Чайтанью в его граде.</w:t>
+        <w:t>, у которого некогда в его граде взволновался ум, когда он увидел танец гандхарвов, — и он вошёл в Чайтанью.</w:t>
       </w:r>
     </w:p>
     <w:p>
@@ -1115,7 +1161,7 @@
         <w:t>45.</w:t>
       </w:r>
       <w:r>
-        <w:t xml:space="preserve"> Его дочь — Шри Джанаки, Рукмини и Лакшми — названа именем Лакшми, как это ясно сказано в «Чайтанья-чарите»:</w:t>
+        <w:t xml:space="preserve"> Шри Джанаки и Рукмини — это его дочь по имени Лакшми; так она и названа Лакшми в «Чайтанья-чарите»:</w:t>
       </w:r>
     </w:p>
     <w:p>
@@ -1131,7 +1177,7 @@
         <w:t>46.</w:t>
       </w:r>
       <w:r>
-        <w:t xml:space="preserve"> «Та дочь Валлабхачарьи, Лакшми, воплотившаяся ради него, отправившись с подругами омыться в божественном пруду, попала тогда в поле зрения Прабху».</w:t>
+        <w:t xml:space="preserve"> «Та дочь Валлабхачарьи, Лакшми, воплотившаяся ради него, отправившись с подругами омыться в небесной реке (Ганге), попала тогда в поле зрения Прабху».</w:t>
       </w:r>
     </w:p>
     <w:p>
@@ -1308,7 +1354,7 @@
         <w:t>55.</w:t>
       </w:r>
       <w:r>
-        <w:t xml:space="preserve"> Вкусив собственного настроения и томясь в разлуке с Радхой, Чайтанья сам называл Пундарику «отцом».</w:t>
+        <w:t xml:space="preserve"> Вкусив собственного настроения и томясь разлукой, как Радха, Чайтанья сам называл Пундарику «отцом».</w:t>
       </w:r>
     </w:p>
     <w:p>
@@ -1879,7 +1925,7 @@
         <w:t>64.</w:t>
       </w:r>
       <w:r>
-        <w:t xml:space="preserve"> Он, своей частью Шешей являющийся ложем, обителью и одеждой Вишну и Кришны, а в облике украшений его тела — браслетов и прочего, — знает сокровенные игры силою, называемой лилой.</w:t>
+        <w:t xml:space="preserve"> Он, своей частью Шешей являющийся ложем, одеждой и украшением Вишну и Кришны, а в облике украшений его тела — браслетов и прочего, — знает сокровенные игры силою, называемой лилой.</w:t>
       </w:r>
     </w:p>
     <w:p>
@@ -1895,7 +1941,7 @@
         <w:t>65.</w:t>
       </w:r>
       <w:r>
-        <w:t xml:space="preserve"> Две его возлюбленные — Васудха и Джахнави, родившиеся в роду Варуни и Ревати</w:t>
+        <w:t xml:space="preserve"> Две его возлюбленные — Васудха и Джахнави, являющиеся Варуни и Ревати, рождённой в роду Реваты</w:t>
       </w:r>
       <w:r>
         <w:rPr>
@@ -1933,7 +1979,7 @@
         <w:t>66.</w:t>
       </w:r>
       <w:r>
-        <w:t xml:space="preserve"> Некоторые объясняют Шри Васудху-деви как частичное проявление; Джахнави некоторые называют Ананга-манджари. По прежнему правилу святые признают верным и то и другое.</w:t>
+        <w:t xml:space="preserve"> Некоторые в [век] Кали объявляют [Ананга-манджари] Шри Васудху-деви, а некоторые называют Ананга-манджари Джахнави. По прежнему правилу [различия проявлений] святые признают верным и то и другое.</w:t>
       </w:r>
     </w:p>
     <w:p>
@@ -2008,7 +2054,7 @@
         <w:t>70.</w:t>
       </w:r>
       <w:r>
-        <w:t xml:space="preserve"> Третий вьюха, Прадьюмна, стал близким другом-наперсником (прия-нарма-сакха), помогавшим в лилах Радхи и Мадхавы во Врадже; он, неотличный по телу от Шри Чайтаньи и Адвайты, — это Рагхунандана</w:t>
+        <w:t xml:space="preserve"> Третий вьюха, Прадьюмна, стал близким другом-наперсником (прия-нарма-сакха), помогавшим в лилах Радхи и Мадхавы во Врадже; он, неотличный по телу от Шри Чайтаньи, — это Рагхунандана</w:t>
       </w:r>
       <w:r>
         <w:rPr>
@@ -2236,7 +2282,7 @@
         <w:t>81.</w:t>
       </w:r>
       <w:r>
-        <w:t xml:space="preserve"> Друг Махадевы Кубера, владыка гухьяков, ныне — Кубера Пандит, отец того, кто нагой</w:t>
+        <w:t xml:space="preserve"> Друг Махадевы Кубера, владыка гухьяков, ныне — Кубера Пандит, отец его [Адвайты], «нагой»</w:t>
       </w:r>
       <w:r>
         <w:rPr>
@@ -2327,7 +2373,7 @@
         <w:t>86.</w:t>
       </w:r>
       <w:r>
-        <w:t xml:space="preserve"> Бхагавати Йогамайя ныне — его супруга, нисшедшая как Сита; по её проявлению — та, что зовётся Шри</w:t>
+        <w:t xml:space="preserve"> Бхагавати Йогамайя ныне — его [Адвайты] супруга, нисшедшая как Сита; по её проявлению — та, что зовётся Шри</w:t>
       </w:r>
       <w:r>
         <w:rPr>
@@ -2408,18 +2454,7 @@
         <w:t>89.</w:t>
       </w:r>
       <w:r>
-        <w:t xml:space="preserve"> [Служанки Ситы] Нандини и Джангали — это, по порядку, Джая и Виджая</w:t>
-      </w:r>
-      <w:r>
-        <w:rPr>
-          <w:b w:val="0"/>
-          <w:i w:val="0"/>
-          <w:vertAlign w:val="superscript"/>
-        </w:rPr>
-        <w:t>32</w:t>
-      </w:r>
-      <w:r>
-        <w:t>.</w:t>
+        <w:t xml:space="preserve"> [Служанки Ситы] Нандини и Джангали — это, по порядку, Джая и Виджая.</w:t>
       </w:r>
     </w:p>
     <w:p>
@@ -2502,7 +2537,7 @@
         <w:t>93.</w:t>
       </w:r>
       <w:r>
-        <w:t xml:space="preserve"> Сын муни Ричики по имени Брахма, великий подвижник, родился вместе с Прахладой и стал Харидасом.</w:t>
+        <w:t xml:space="preserve"> Сын муни Ричики по имени Брахма, великий подвижник, родился вместе с Прахладой [в одном лице] и стал Харидасом.</w:t>
       </w:r>
     </w:p>
     <w:p>
@@ -2652,7 +2687,7 @@
         <w:t>101.</w:t>
       </w:r>
       <w:r>
-        <w:t xml:space="preserve"> Васудева, именуемый Тиртхой, Шри Рама, Пурушоттама, Авадхута по имени Гаруда и Шри Гопендра по прозванию Ашрама.</w:t>
+        <w:t xml:space="preserve"> Васудева, именуемый Тиртхой, Шри Рама, Пурушоттама — [он же] Авадхута по имени Гаруда — и Шри Гопендра по прозванию Ашрама.</w:t>
       </w:r>
     </w:p>
     <w:p>
@@ -3018,7 +3053,7 @@
         <w:t>122.</w:t>
       </w:r>
       <w:r>
-        <w:t xml:space="preserve"> Некоторые называют его Лалитой, и с этим соглашается кое-кто ещё. Гаура сказал Бхавананде: «Ты — Притхапати»</w:t>
+        <w:t xml:space="preserve"> Некоторые называют его Лалитой, но с этим согласен лишь кое-кто: ведь Гаура сказал Бхавананде: «Ты — Притхапати»</w:t>
       </w:r>
       <w:r>
         <w:rPr>
@@ -3273,7 +3308,7 @@
         <w:rPr>
           <w:sz w:val="18"/>
         </w:rPr>
-        <w:t xml:space="preserve"> «Нагой» (дигамбара) — Шива; в издании отмечено разночтение.</w:t>
+        <w:t xml:space="preserve"> «Нагой» (дигамбара) — эпитет Шивы (по изданию — Махадевы); в издании отмечено разночтение «видамбара» («лучший из знающих»).</w:t>
       </w:r>
     </w:p>
     <w:p>
@@ -3347,13 +3382,13 @@
           <w:i w:val="0"/>
           <w:sz w:val="18"/>
         </w:rPr>
-        <w:t>32.</w:t>
+        <w:t>33.</w:t>
       </w:r>
       <w:r>
         <w:rPr>
           <w:sz w:val="18"/>
         </w:rPr>
-        <w:t xml:space="preserve"> Строки о служанках в извлечённом тексте неполны; перевод по сохранившейся части.</w:t>
+        <w:t xml:space="preserve"> Ср. «Чайтанья-чаритамрита» (Антья 8): упрёки Рамачандры Пури заставили Чайтанью урезать свою пищу.</w:t>
       </w:r>
     </w:p>
     <w:p>
@@ -3367,13 +3402,13 @@
           <w:i w:val="0"/>
           <w:sz w:val="18"/>
         </w:rPr>
-        <w:t>33.</w:t>
+        <w:t>34.</w:t>
       </w:r>
       <w:r>
         <w:rPr>
           <w:sz w:val="18"/>
         </w:rPr>
-        <w:t xml:space="preserve"> Ср. «Чайтанья-чаритамрита» (Антья 8): упрёки Рамачандры Пури заставили Чайтанью урезать свою пищу.</w:t>
+        <w:t xml:space="preserve"> Харидас Тхакур, родившийся в мусульманской семье.</w:t>
       </w:r>
     </w:p>
     <w:p>
@@ -3387,13 +3422,13 @@
           <w:i w:val="0"/>
           <w:sz w:val="18"/>
         </w:rPr>
-        <w:t>34.</w:t>
+        <w:t>35.</w:t>
       </w:r>
       <w:r>
         <w:rPr>
           <w:sz w:val="18"/>
         </w:rPr>
-        <w:t xml:space="preserve"> Харидас Тхакур, родившийся в мусульманской семье.</w:t>
+        <w:t xml:space="preserve"> Анима и прочие — восемь мистических совершенств йоги.</w:t>
       </w:r>
     </w:p>
     <w:p>
@@ -3407,13 +3442,13 @@
           <w:i w:val="0"/>
           <w:sz w:val="18"/>
         </w:rPr>
-        <w:t>35.</w:t>
+        <w:t>36.</w:t>
       </w:r>
       <w:r>
         <w:rPr>
           <w:sz w:val="18"/>
         </w:rPr>
-        <w:t xml:space="preserve"> Анима и прочие — восемь мистических совершенств йоги.</w:t>
+        <w:t xml:space="preserve"> Валлабха Бхатта — основатель сампрадаи пуштимарги.</w:t>
       </w:r>
     </w:p>
     <w:p>
@@ -3427,13 +3462,13 @@
           <w:i w:val="0"/>
           <w:sz w:val="18"/>
         </w:rPr>
-        <w:t>36.</w:t>
+        <w:t>37.</w:t>
       </w:r>
       <w:r>
         <w:rPr>
           <w:sz w:val="18"/>
         </w:rPr>
-        <w:t xml:space="preserve"> Валлабха Бхатта — основатель сампрадаи пуштимарги.</w:t>
+        <w:t xml:space="preserve"> Издание толкует строку иначе: скитаясь от горя бедности, он в обществе Прабху обрёл богатство премы.</w:t>
       </w:r>
     </w:p>
     <w:p>
@@ -3447,16 +3482,1519 @@
           <w:i w:val="0"/>
           <w:sz w:val="18"/>
         </w:rPr>
-        <w:t>37.</w:t>
+        <w:t>38.</w:t>
       </w:r>
       <w:r>
         <w:rPr>
           <w:sz w:val="18"/>
         </w:rPr>
-        <w:t xml:space="preserve"> Строка сохранена в издании с небольшой порчей; смысл восстановлен по контексту.</w:t>
+        <w:t xml:space="preserve"> Бхавананда Рай, отец Рамананды; Притхапати — «супруг Притхи», т. е. Панду.</w:t>
       </w:r>
     </w:p>
     <w:p>
+      <w:r>
+        <w:br w:type="page"/>
+      </w:r>
+    </w:p>
+    <w:p>
+      <w:pPr>
+        <w:pStyle w:val="Heading1"/>
+        <w:jc w:val="center"/>
+      </w:pPr>
+      <w:r>
+        <w:t>Часть 3</w:t>
+      </w:r>
+    </w:p>
+    <w:p>
+      <w:pPr>
+        <w:spacing w:after="60"/>
+        <w:jc w:val="both"/>
+      </w:pPr>
+      <w:r>
+        <w:rPr>
+          <w:b w:val="0"/>
+          <w:i/>
+        </w:rPr>
+        <w:t>Друзья-пастушки Враджа. Слуги и музыканты. Гопи: Гададхара и Лалита, восемь сакхи и другие. Манджари и Госвами Вриндаваны. Заключение (шлоки 124–215)</w:t>
+      </w:r>
+    </w:p>
+    <w:p>
+      <w:pPr>
+        <w:spacing w:after="60"/>
+        <w:ind w:left="510" w:hanging="510"/>
+      </w:pPr>
+      <w:r>
+        <w:rPr>
+          <w:b/>
+          <w:i w:val="0"/>
+        </w:rPr>
+        <w:t>124.</w:t>
+      </w:r>
+      <w:r>
+        <w:t xml:space="preserve"> «И Арджуна, сын Панду, тотчас стал гопи Арджунией», — это ясно сказано в «Падма-уттара-кханде». Поэтому почтенный Рамананда Рай — эти трое</w:t>
+      </w:r>
+      <w:r>
+        <w:rPr>
+          <w:b w:val="0"/>
+          <w:i w:val="0"/>
+          <w:vertAlign w:val="superscript"/>
+        </w:rPr>
+        <w:t>39</w:t>
+      </w:r>
+      <w:r>
+        <w:t>.</w:t>
+      </w:r>
+    </w:p>
+    <w:p>
+      <w:pPr>
+        <w:pStyle w:val="Heading2"/>
+      </w:pPr>
+      <w:r>
+        <w:t>Друзья-пастушки</w:t>
+      </w:r>
+    </w:p>
+    <w:p>
+      <w:pPr>
+        <w:spacing w:after="60"/>
+        <w:ind w:left="510" w:hanging="510"/>
+      </w:pPr>
+      <w:r>
+        <w:rPr>
+          <w:b/>
+          <w:i w:val="0"/>
+        </w:rPr>
+        <w:t>125.</w:t>
+      </w:r>
+      <w:r>
+        <w:t xml:space="preserve"> Теперь кратко, по моему разумению, называются преданные из Враджа.</w:t>
+      </w:r>
+    </w:p>
+    <w:p>
+      <w:pPr>
+        <w:spacing w:after="60"/>
+        <w:ind w:left="510" w:hanging="510"/>
+      </w:pPr>
+      <w:r>
+        <w:rPr>
+          <w:b/>
+          <w:i w:val="0"/>
+        </w:rPr>
+        <w:t>126.</w:t>
+      </w:r>
+      <w:r>
+        <w:t xml:space="preserve"> Тот, кто прежде звался Шридамой, ныне — великий Абхирама; это он нёс бревно, которое могли поднять лишь тридцать два человека.</w:t>
+      </w:r>
+    </w:p>
+    <w:p>
+      <w:pPr>
+        <w:spacing w:after="60"/>
+        <w:ind w:left="510" w:hanging="510"/>
+      </w:pPr>
+      <w:r>
+        <w:rPr>
+          <w:b/>
+          <w:i w:val="0"/>
+        </w:rPr>
+        <w:t>127.</w:t>
+      </w:r>
+      <w:r>
+        <w:t xml:space="preserve"> Тот, кто прежде звался Судамой, ныне — Тхакур Сундара</w:t>
+      </w:r>
+      <w:r>
+        <w:rPr>
+          <w:b w:val="0"/>
+          <w:i w:val="0"/>
+          <w:vertAlign w:val="superscript"/>
+        </w:rPr>
+        <w:t>40</w:t>
+      </w:r>
+      <w:r>
+        <w:t>; друг Васудама — это Пандит Шри Дхананджая.</w:t>
+      </w:r>
+    </w:p>
+    <w:p>
+      <w:pPr>
+        <w:spacing w:after="60"/>
+        <w:ind w:left="510" w:hanging="510"/>
+      </w:pPr>
+      <w:r>
+        <w:rPr>
+          <w:b/>
+          <w:i w:val="0"/>
+        </w:rPr>
+        <w:t>128.</w:t>
+      </w:r>
+      <w:r>
+        <w:t xml:space="preserve"> Субала, лучший из любимых друзей, — это Гаури Дас Пандит; могучий Махабала — это Камалакара Пиппалаи.</w:t>
+      </w:r>
+    </w:p>
+    <w:p>
+      <w:pPr>
+        <w:spacing w:after="60"/>
+        <w:ind w:left="510" w:hanging="510"/>
+      </w:pPr>
+      <w:r>
+        <w:rPr>
+          <w:b/>
+          <w:i w:val="0"/>
+        </w:rPr>
+        <w:t>129.</w:t>
+      </w:r>
+      <w:r>
+        <w:t xml:space="preserve"> Пастух Враджа Субаху — это Уддхарана Датта; друг во Врадже Махабаху — это Шриман Махеша Пандит.</w:t>
+      </w:r>
+    </w:p>
+    <w:p>
+      <w:pPr>
+        <w:spacing w:after="60"/>
+        <w:ind w:left="510" w:hanging="510"/>
+      </w:pPr>
+      <w:r>
+        <w:rPr>
+          <w:b/>
+          <w:i w:val="0"/>
+        </w:rPr>
+        <w:t>130.</w:t>
+      </w:r>
+      <w:r>
+        <w:t xml:space="preserve"> Прежний друг Стокакришна — это Шри Пурушоттама Дас.</w:t>
+      </w:r>
+    </w:p>
+    <w:p>
+      <w:pPr>
+        <w:spacing w:after="60"/>
+        <w:ind w:left="510" w:hanging="510"/>
+      </w:pPr>
+      <w:r>
+        <w:rPr>
+          <w:b/>
+          <w:i w:val="0"/>
+        </w:rPr>
+        <w:t>131.</w:t>
+      </w:r>
+      <w:r>
+        <w:t xml:space="preserve"> Сын Садашивы по имени Нагара Пурушоттама, родившийся в роду вайдьев, — это пастух Враджа Дама.</w:t>
+      </w:r>
+    </w:p>
+    <w:p>
+      <w:pPr>
+        <w:spacing w:after="60"/>
+        <w:ind w:left="510" w:hanging="510"/>
+      </w:pPr>
+      <w:r>
+        <w:rPr>
+          <w:b/>
+          <w:i w:val="0"/>
+        </w:rPr>
+        <w:t>132.</w:t>
+      </w:r>
+      <w:r>
+        <w:t xml:space="preserve"> Прежний друг по имени Арджуна — это Шри Парамешвара Дас; друг Враджа Лаванга — это Кала Кришнадас.</w:t>
+      </w:r>
+    </w:p>
+    <w:p>
+      <w:pPr>
+        <w:spacing w:after="60"/>
+        <w:ind w:left="510" w:hanging="510"/>
+      </w:pPr>
+      <w:r>
+        <w:rPr>
+          <w:b/>
+          <w:i w:val="0"/>
+        </w:rPr>
+        <w:t>133.</w:t>
+      </w:r>
+      <w:r>
+        <w:t xml:space="preserve"> Брахман Шридхара Пандит, известный как Кхола-веча</w:t>
+      </w:r>
+      <w:r>
+        <w:rPr>
+          <w:b w:val="0"/>
+          <w:i w:val="0"/>
+          <w:vertAlign w:val="superscript"/>
+        </w:rPr>
+        <w:t>41</w:t>
+      </w:r>
+      <w:r>
+        <w:t>, был во Врадже шутником по имени Кусумасава.</w:t>
+      </w:r>
+    </w:p>
+    <w:p>
+      <w:pPr>
+        <w:spacing w:after="60"/>
+        <w:ind w:left="510" w:hanging="510"/>
+      </w:pPr>
+      <w:r>
+        <w:rPr>
+          <w:b/>
+          <w:i w:val="0"/>
+        </w:rPr>
+        <w:t>134.</w:t>
+      </w:r>
+      <w:r>
+        <w:t xml:space="preserve"> Пастушок по имени Прабала, друг Баларамы, бывший прежде во Врадже, — это ныне Халаюдха Тхакур.</w:t>
+      </w:r>
+    </w:p>
+    <w:p>
+      <w:pPr>
+        <w:spacing w:after="60"/>
+        <w:ind w:left="510" w:hanging="510"/>
+      </w:pPr>
+      <w:r>
+        <w:rPr>
+          <w:b/>
+          <w:i w:val="0"/>
+        </w:rPr>
+        <w:t>135.</w:t>
+      </w:r>
+      <w:r>
+        <w:t xml:space="preserve"> Друг Кришначандры во Врадже по имени Варутхапа — это Рудра Пандит, любимец Гауранги.</w:t>
+      </w:r>
+    </w:p>
+    <w:p>
+      <w:pPr>
+        <w:spacing w:after="60"/>
+        <w:ind w:left="510" w:hanging="510"/>
+      </w:pPr>
+      <w:r>
+        <w:rPr>
+          <w:b/>
+          <w:i w:val="0"/>
+        </w:rPr>
+        <w:t>136.</w:t>
+      </w:r>
+      <w:r>
+        <w:t xml:space="preserve"> Пастух Враджа Гандхарва — это Кумудананда Пандит.</w:t>
+      </w:r>
+    </w:p>
+    <w:p>
+      <w:pPr>
+        <w:pStyle w:val="Heading2"/>
+      </w:pPr>
+      <w:r>
+        <w:t>Слуги, певцы и музыканты</w:t>
+      </w:r>
+    </w:p>
+    <w:p>
+      <w:pPr>
+        <w:spacing w:after="60"/>
+        <w:ind w:left="510" w:hanging="510"/>
+      </w:pPr>
+      <w:r>
+        <w:rPr>
+          <w:b/>
+          <w:i w:val="0"/>
+        </w:rPr>
+        <w:t>137.</w:t>
+      </w:r>
+      <w:r>
+        <w:t xml:space="preserve"> Два слуги во Вриндаване, Бхрингара и Бхангура, родились слугами Прабху — Шри Кашишварой и Говиндой.</w:t>
+      </w:r>
+    </w:p>
+    <w:p>
+      <w:pPr>
+        <w:spacing w:after="60"/>
+        <w:ind w:left="510" w:hanging="510"/>
+      </w:pPr>
+      <w:r>
+        <w:rPr>
+          <w:b/>
+          <w:i w:val="0"/>
+        </w:rPr>
+        <w:t>138.</w:t>
+      </w:r>
+      <w:r>
+        <w:t xml:space="preserve"> Два слуги во Вриндаване, Рактака и Патрака, ныне служат Гауранге — это Харидас Старший и Харидас Младший</w:t>
+      </w:r>
+      <w:r>
+        <w:rPr>
+          <w:b w:val="0"/>
+          <w:i w:val="0"/>
+          <w:vertAlign w:val="superscript"/>
+        </w:rPr>
+        <w:t>42</w:t>
+      </w:r>
+      <w:r>
+        <w:t>.</w:t>
+      </w:r>
+    </w:p>
+    <w:p>
+      <w:pPr>
+        <w:spacing w:after="60"/>
+        <w:ind w:left="510" w:hanging="510"/>
+      </w:pPr>
+      <w:r>
+        <w:rPr>
+          <w:b/>
+          <w:i w:val="0"/>
+        </w:rPr>
+        <w:t>139.</w:t>
+      </w:r>
+      <w:r>
+        <w:t xml:space="preserve"> Двое, Пайода и Варида, прежде готовившие воду, ныне — слуги, известные как Рамаи и Нандаи.</w:t>
+      </w:r>
+    </w:p>
+    <w:p>
+      <w:pPr>
+        <w:spacing w:after="60"/>
+        <w:ind w:left="510" w:hanging="510"/>
+      </w:pPr>
+      <w:r>
+        <w:rPr>
+          <w:b/>
+          <w:i w:val="0"/>
+        </w:rPr>
+        <w:t>140.</w:t>
+      </w:r>
+      <w:r>
+        <w:t xml:space="preserve"> Два певца Враджа, Мадхуканта и Мадхуврата, — это певцы Гауранги Мукунда и Васудева Датта.</w:t>
+      </w:r>
+    </w:p>
+    <w:p>
+      <w:pPr>
+        <w:spacing w:after="60"/>
+        <w:ind w:left="510" w:hanging="510"/>
+      </w:pPr>
+      <w:r>
+        <w:rPr>
+          <w:b/>
+          <w:i w:val="0"/>
+        </w:rPr>
+        <w:t>141.</w:t>
+      </w:r>
+      <w:r>
+        <w:t xml:space="preserve"> Прежний актёр Чандрамукха — это Макарадхваджа Кара.</w:t>
+      </w:r>
+    </w:p>
+    <w:p>
+      <w:pPr>
+        <w:spacing w:after="60"/>
+        <w:ind w:left="510" w:hanging="510"/>
+      </w:pPr>
+      <w:r>
+        <w:rPr>
+          <w:b/>
+          <w:i w:val="0"/>
+        </w:rPr>
+        <w:t>142.</w:t>
+      </w:r>
+      <w:r>
+        <w:t xml:space="preserve"> Тот, кто прежде во Врадже был барабанщиком на мриданге по имени Шри Судхакара, ныне — Шри Шанкара Гхош, искусный в игре на дамфе.</w:t>
+      </w:r>
+    </w:p>
+    <w:p>
+      <w:pPr>
+        <w:spacing w:after="60"/>
+        <w:ind w:left="510" w:hanging="510"/>
+      </w:pPr>
+      <w:r>
+        <w:rPr>
+          <w:b/>
+          <w:i w:val="0"/>
+        </w:rPr>
+        <w:t>143.</w:t>
+      </w:r>
+      <w:r>
+        <w:t xml:space="preserve"> Чандрахаса, танцор Враджа, знаток расы, — это любитель танца Шри Джагадиша Пандит.</w:t>
+      </w:r>
+    </w:p>
+    <w:p>
+      <w:pPr>
+        <w:spacing w:after="60"/>
+        <w:ind w:left="510" w:hanging="510"/>
+      </w:pPr>
+      <w:r>
+        <w:rPr>
+          <w:b/>
+          <w:i w:val="0"/>
+        </w:rPr>
+        <w:t>144.</w:t>
+      </w:r>
+      <w:r>
+        <w:t xml:space="preserve"> Тот, кто во Врадже по имени Маладхара держал флейту-вену и мурали, ныне — Пандит по имени Ванамали, любимец Гауры.</w:t>
+      </w:r>
+    </w:p>
+    <w:p>
+      <w:pPr>
+        <w:spacing w:after="60"/>
+        <w:ind w:left="510" w:hanging="510"/>
+      </w:pPr>
+      <w:r>
+        <w:rPr>
+          <w:b/>
+          <w:i w:val="0"/>
+        </w:rPr>
+        <w:t>145.</w:t>
+      </w:r>
+      <w:r>
+        <w:t xml:space="preserve"> Два прославленных попугая Вриндаваны, Дакша и Вичакшана, ныне родились моими старшими братьями — Чайтаньей и Рамадасом</w:t>
+      </w:r>
+      <w:r>
+        <w:rPr>
+          <w:b w:val="0"/>
+          <w:i w:val="0"/>
+          <w:vertAlign w:val="superscript"/>
+        </w:rPr>
+        <w:t>43</w:t>
+      </w:r>
+      <w:r>
+        <w:t>.</w:t>
+      </w:r>
+    </w:p>
+    <w:p>
+      <w:pPr>
+        <w:pStyle w:val="Heading2"/>
+      </w:pPr>
+      <w:r>
+        <w:t>Гопи — «сила преданного»</w:t>
+      </w:r>
+    </w:p>
+    <w:p>
+      <w:pPr>
+        <w:spacing w:after="60"/>
+        <w:ind w:left="510" w:hanging="510"/>
+      </w:pPr>
+      <w:r>
+        <w:rPr>
+          <w:b/>
+          <w:i w:val="0"/>
+        </w:rPr>
+        <w:t>146.</w:t>
+      </w:r>
+      <w:r>
+        <w:t xml:space="preserve"> Теперь, сообразно разумению и услышанному, называются те из пастушек, кто стал любимцами Прабху.</w:t>
+      </w:r>
+    </w:p>
+    <w:p>
+      <w:pPr>
+        <w:spacing w:after="60"/>
+        <w:ind w:left="510" w:hanging="510"/>
+      </w:pPr>
+      <w:r>
+        <w:rPr>
+          <w:b/>
+          <w:i w:val="0"/>
+        </w:rPr>
+        <w:t>147.</w:t>
+      </w:r>
+      <w:r>
+        <w:t xml:space="preserve"> Шри Радха, воплощённая любовь, некогда бывшая Владычицей Вриндаваны, — это Шри Гададхара, любимец Гауры, называемый Пандитом.</w:t>
+      </w:r>
+    </w:p>
+    <w:p>
+      <w:pPr>
+        <w:spacing w:after="60"/>
+        <w:ind w:left="510" w:hanging="510"/>
+      </w:pPr>
+      <w:r>
+        <w:rPr>
+          <w:b/>
+          <w:i w:val="0"/>
+        </w:rPr>
+        <w:t>148.</w:t>
+      </w:r>
+      <w:r>
+        <w:t xml:space="preserve"> Как определил Шри Сварупа, он — Лакшми Враджа:</w:t>
+      </w:r>
+    </w:p>
+    <w:p>
+      <w:pPr>
+        <w:spacing w:after="60"/>
+        <w:ind w:left="510" w:hanging="510"/>
+      </w:pPr>
+      <w:r>
+        <w:rPr>
+          <w:b/>
+          <w:i w:val="0"/>
+        </w:rPr>
+        <w:t>149.</w:t>
+      </w:r>
+      <w:r>
+        <w:t xml:space="preserve"> «Лакшми, некогда возлюбленная Шьямасундары во Вриндаване, ныне — Лакшми любви Гауры, Шри Гададхара Пандит».</w:t>
+      </w:r>
+    </w:p>
+    <w:p>
+      <w:pPr>
+        <w:spacing w:after="60"/>
+        <w:ind w:left="510" w:hanging="510"/>
+      </w:pPr>
+      <w:r>
+        <w:rPr>
+          <w:b/>
+          <w:i w:val="0"/>
+        </w:rPr>
+        <w:t>150.</w:t>
+      </w:r>
+      <w:r>
+        <w:t xml:space="preserve"> Поскольку Лалита — спутница Радхи, «Анурадхика», она тоже вошла в него, как сказано в «Гаура-чандродае»:</w:t>
+      </w:r>
+    </w:p>
+    <w:p>
+      <w:pPr>
+        <w:spacing w:after="60"/>
+        <w:ind w:left="510" w:hanging="510"/>
+      </w:pPr>
+      <w:r>
+        <w:rPr>
+          <w:b/>
+          <w:i w:val="0"/>
+        </w:rPr>
+        <w:t>151.</w:t>
+      </w:r>
+      <w:r>
+        <w:t xml:space="preserve"> «Это тоже Лалита, подруга Радхики, а вовсе не этот владыка брахманов Гададхара; или же этот Хари своей собственной силой стал троицей — Им самим, подругой и Радхикой».</w:t>
+      </w:r>
+    </w:p>
+    <w:p>
+      <w:pPr>
+        <w:spacing w:after="60"/>
+        <w:ind w:left="510" w:hanging="510"/>
+      </w:pPr>
+      <w:r>
+        <w:rPr>
+          <w:b/>
+          <w:i w:val="0"/>
+        </w:rPr>
+        <w:t>152.</w:t>
+      </w:r>
+      <w:r>
+        <w:t xml:space="preserve"> Другие говорили, что Лалита — это Дхрувананда Брахмачари; по различию своих проявлений верно и это мнение.</w:t>
+      </w:r>
+    </w:p>
+    <w:p>
+      <w:pPr>
+        <w:spacing w:after="60"/>
+        <w:ind w:left="510" w:hanging="510"/>
+      </w:pPr>
+      <w:r>
+        <w:rPr>
+          <w:b/>
+          <w:i w:val="0"/>
+        </w:rPr>
+        <w:t>153.</w:t>
+      </w:r>
+      <w:r>
+        <w:t xml:space="preserve"> Или же Бхагаван Гаура по собственной воле принял троякий облик; поэтому Шри Гададхара Пандит — это облик Шри Радхики.</w:t>
+      </w:r>
+    </w:p>
+    <w:p>
+      <w:pPr>
+        <w:spacing w:after="60"/>
+        <w:ind w:left="510" w:hanging="510"/>
+      </w:pPr>
+      <w:r>
+        <w:rPr>
+          <w:b/>
+          <w:i w:val="0"/>
+        </w:rPr>
+        <w:t>154.</w:t>
+      </w:r>
+      <w:r>
+        <w:t xml:space="preserve"> Чандраканти, бывшая проявлением славы Радхи, ныне рядом с Гаурангой — Гададхара из рода Дасов</w:t>
+      </w:r>
+      <w:r>
+        <w:rPr>
+          <w:b w:val="0"/>
+          <w:i w:val="0"/>
+          <w:vertAlign w:val="superscript"/>
+        </w:rPr>
+        <w:t>44</w:t>
+      </w:r>
+      <w:r>
+        <w:t>.</w:t>
+      </w:r>
+    </w:p>
+    <w:p>
+      <w:pPr>
+        <w:spacing w:after="60"/>
+        <w:ind w:left="510" w:hanging="510"/>
+      </w:pPr>
+      <w:r>
+        <w:rPr>
+          <w:b/>
+          <w:i w:val="0"/>
+        </w:rPr>
+        <w:t>155.</w:t>
+      </w:r>
+      <w:r>
+        <w:t xml:space="preserve"> Пурнананда, первая среди возлюбленных Баладевы во Врадже, тоже ради дела вошла в этого Гададхару.</w:t>
+      </w:r>
+    </w:p>
+    <w:p>
+      <w:pPr>
+        <w:spacing w:after="60"/>
+        <w:ind w:left="510" w:hanging="510"/>
+      </w:pPr>
+      <w:r>
+        <w:rPr>
+          <w:b/>
+          <w:i w:val="0"/>
+        </w:rPr>
+        <w:t>156.</w:t>
+      </w:r>
+      <w:r>
+        <w:t xml:space="preserve"> Чандравали, некогда высшая возлюбленная Кришны во Врадже, ныне в Гауде — это Кавираджа Садашива.</w:t>
+      </w:r>
+    </w:p>
+    <w:p>
+      <w:pPr>
+        <w:spacing w:after="60"/>
+        <w:ind w:left="510" w:hanging="510"/>
+      </w:pPr>
+      <w:r>
+        <w:rPr>
+          <w:b/>
+          <w:i w:val="0"/>
+        </w:rPr>
+        <w:t>157.</w:t>
+      </w:r>
+      <w:r>
+        <w:t xml:space="preserve"> Шри Бхадра, на груди которой некогда спал Кришна во Вриндаване, ныне — любимец Гауранги Шанкара Пандит.</w:t>
+      </w:r>
+    </w:p>
+    <w:p>
+      <w:pPr>
+        <w:spacing w:after="60"/>
+        <w:ind w:left="510" w:hanging="510"/>
+      </w:pPr>
+      <w:r>
+        <w:rPr>
+          <w:b/>
+          <w:i w:val="0"/>
+        </w:rPr>
+        <w:t>158.</w:t>
+      </w:r>
+      <w:r>
+        <w:t xml:space="preserve"> Тарака и Пали, некогда пребывавшие во Враджа-мандале, ныне — любимцы Прабху Джаганнатха и Шри Гопала.</w:t>
+      </w:r>
+    </w:p>
+    <w:p>
+      <w:pPr>
+        <w:spacing w:after="60"/>
+        <w:ind w:left="510" w:hanging="510"/>
+      </w:pPr>
+      <w:r>
+        <w:rPr>
+          <w:b/>
+          <w:i w:val="0"/>
+        </w:rPr>
+        <w:t>159.</w:t>
+      </w:r>
+      <w:r>
+        <w:t xml:space="preserve"> Шайбья, во Врадже отличавшаяся резким нравом, — это Дамодара Пандит; по некоей причине в него вошла и богиня Сарасвати.</w:t>
+      </w:r>
+      <w:r>
+        <w:rPr>
+          <w:b w:val="0"/>
+          <w:i w:val="0"/>
+          <w:vertAlign w:val="superscript"/>
+        </w:rPr>
+        <w:t>45</w:t>
+      </w:r>
+    </w:p>
+    <w:p>
+      <w:pPr>
+        <w:spacing w:after="60"/>
+        <w:ind w:left="510" w:hanging="510"/>
+      </w:pPr>
+      <w:r>
+        <w:rPr>
+          <w:b/>
+          <w:i w:val="0"/>
+        </w:rPr>
+        <w:t>160.</w:t>
+      </w:r>
+      <w:r>
+        <w:t xml:space="preserve"> Вишакха, что некогда во Врадже учила Радху искусствам, ныне — Сварупа Госвами, наслаждающийся теми же чувствами.</w:t>
+      </w:r>
+    </w:p>
+    <w:p>
+      <w:pPr>
+        <w:spacing w:after="60"/>
+        <w:ind w:left="510" w:hanging="510"/>
+      </w:pPr>
+      <w:r>
+        <w:rPr>
+          <w:b/>
+          <w:i w:val="0"/>
+        </w:rPr>
+        <w:t>161.</w:t>
+      </w:r>
+      <w:r>
+        <w:t xml:space="preserve"> Читра, которая некогда во Врадже укладывала волосы Радхе, ныне — Кавираджа Шри Ванамали, любимец Прабху.</w:t>
+      </w:r>
+    </w:p>
+    <w:p>
+      <w:pPr>
+        <w:spacing w:after="60"/>
+        <w:ind w:left="510" w:hanging="510"/>
+      </w:pPr>
+      <w:r>
+        <w:rPr>
+          <w:b/>
+          <w:i w:val="0"/>
+        </w:rPr>
+        <w:t>162.</w:t>
+      </w:r>
+      <w:r>
+        <w:t xml:space="preserve"> Шри Чампакалата, бывшая жизнью Шри Радхи во Врадже, ныне — Рагхава Госвами, поселившийся у Говардханы, составивший книгу «Бхакти-ратна-пракаша».</w:t>
+      </w:r>
+    </w:p>
+    <w:p>
+      <w:pPr>
+        <w:spacing w:after="60"/>
+        <w:ind w:left="510" w:hanging="510"/>
+      </w:pPr>
+      <w:r>
+        <w:rPr>
+          <w:b/>
+          <w:i w:val="0"/>
+        </w:rPr>
+        <w:t>163.</w:t>
+      </w:r>
+      <w:r>
+        <w:t xml:space="preserve"> Тунгавидья, бывшая во Врадже знатоком всех шастр, — это отшельник Прабодхананда, Сарасвати, воспевающий Гауру.</w:t>
+      </w:r>
+    </w:p>
+    <w:p>
+      <w:pPr>
+        <w:spacing w:after="60"/>
+        <w:ind w:left="510" w:hanging="510"/>
+      </w:pPr>
+      <w:r>
+        <w:rPr>
+          <w:b/>
+          <w:i w:val="0"/>
+        </w:rPr>
+        <w:t>164.</w:t>
+      </w:r>
+      <w:r>
+        <w:t xml:space="preserve"> Индулекха, бывшая некогда во Врадже подругой Шри Радхи, — это Кришнадас Брахмачари, поселившийся во Вриндаване.</w:t>
+      </w:r>
+    </w:p>
+    <w:p>
+      <w:pPr>
+        <w:spacing w:after="60"/>
+        <w:ind w:left="510" w:hanging="510"/>
+      </w:pPr>
+      <w:r>
+        <w:rPr>
+          <w:b/>
+          <w:i w:val="0"/>
+        </w:rPr>
+        <w:t>165.</w:t>
+      </w:r>
+      <w:r>
+        <w:t xml:space="preserve"> Рангадеви — ныне Гададхара Бхатта; Анантачарья Госвами — та, что была Судеви во Врадже.</w:t>
+      </w:r>
+    </w:p>
+    <w:p>
+      <w:pPr>
+        <w:spacing w:after="60"/>
+        <w:ind w:left="510" w:hanging="510"/>
+      </w:pPr>
+      <w:r>
+        <w:rPr>
+          <w:b/>
+          <w:i w:val="0"/>
+        </w:rPr>
+        <w:t>166.</w:t>
+      </w:r>
+      <w:r>
+        <w:t xml:space="preserve"> Шри Кашишвара Госвами — прежняя Шаширекха во Врадже. Дхаништха, приносившая Кришне во Врадже безмерно много угощений, — это ныне любимец Гауранги Рагхава Пандит.</w:t>
+      </w:r>
+    </w:p>
+    <w:p>
+      <w:pPr>
+        <w:spacing w:after="60"/>
+        <w:ind w:left="510" w:hanging="510"/>
+      </w:pPr>
+      <w:r>
+        <w:rPr>
+          <w:b/>
+          <w:i w:val="0"/>
+        </w:rPr>
+        <w:t>167.</w:t>
+      </w:r>
+      <w:r>
+        <w:t xml:space="preserve"> Та, что во Врадже была Гунамалой, — это Дамаянти, его сестра; Ратнарекха — Кришнадас, Калавати — Кришнананда.</w:t>
+      </w:r>
+    </w:p>
+    <w:p>
+      <w:pPr>
+        <w:spacing w:after="60"/>
+        <w:ind w:left="510" w:hanging="510"/>
+      </w:pPr>
+      <w:r>
+        <w:rPr>
+          <w:b/>
+          <w:i w:val="0"/>
+        </w:rPr>
+        <w:t>168.</w:t>
+      </w:r>
+      <w:r>
+        <w:t xml:space="preserve"> Шаурасени — это искусный Нараяна Вачаспати; Кавери — Питамбара; Сукеши — Макарадхваджа.</w:t>
+      </w:r>
+    </w:p>
+    <w:p>
+      <w:pPr>
+        <w:spacing w:after="60"/>
+        <w:ind w:left="510" w:hanging="510"/>
+      </w:pPr>
+      <w:r>
+        <w:rPr>
+          <w:b/>
+          <w:i w:val="0"/>
+        </w:rPr>
+        <w:t>169.</w:t>
+      </w:r>
+      <w:r>
+        <w:t xml:space="preserve"> Мадхави — Мадхавачарья, Индира — Джива Пандит.</w:t>
+      </w:r>
+    </w:p>
+    <w:p>
+      <w:pPr>
+        <w:spacing w:after="60"/>
+        <w:ind w:left="510" w:hanging="510"/>
+      </w:pPr>
+      <w:r>
+        <w:rPr>
+          <w:b/>
+          <w:i w:val="0"/>
+        </w:rPr>
+        <w:t>170.</w:t>
+      </w:r>
+      <w:r>
+        <w:t xml:space="preserve"> Сумадхура, бывшая во Врадже любимицей Тунгавидьи, — это Видья Вачаспати, любимец Гауры и любимец жителей Враджа.</w:t>
+      </w:r>
+    </w:p>
+    <w:p>
+      <w:pPr>
+        <w:spacing w:after="60"/>
+        <w:ind w:left="510" w:hanging="510"/>
+      </w:pPr>
+      <w:r>
+        <w:rPr>
+          <w:b/>
+          <w:i w:val="0"/>
+        </w:rPr>
+        <w:t>171.</w:t>
+      </w:r>
+      <w:r>
+        <w:t xml:space="preserve"> Балабхадра Бхаттачарья — Шри Мадхурекшана; Шринатха Мишра — Читранги; Кавичандра — Манохара.</w:t>
+      </w:r>
+    </w:p>
+    <w:p>
+      <w:pPr>
+        <w:spacing w:after="60"/>
+        <w:ind w:left="510" w:hanging="510"/>
+      </w:pPr>
+      <w:r>
+        <w:rPr>
+          <w:b/>
+          <w:i w:val="0"/>
+        </w:rPr>
+        <w:t>172.</w:t>
+      </w:r>
+      <w:r>
+        <w:t xml:space="preserve"> Нандимукхи, бывшая во Врадже, ныне — Саранга Тхакур. Некоторые считают его Прахладой, но мой отец этого не признаёт.</w:t>
+      </w:r>
+    </w:p>
+    <w:p>
+      <w:pPr>
+        <w:spacing w:after="60"/>
+        <w:ind w:left="510" w:hanging="510"/>
+      </w:pPr>
+      <w:r>
+        <w:rPr>
+          <w:b/>
+          <w:i w:val="0"/>
+        </w:rPr>
+        <w:t>173.</w:t>
+      </w:r>
+      <w:r>
+        <w:t xml:space="preserve"> Калаканти и Суканти, бывшие во Врадже в гандхарвской труппе, — это, соответственно, Рамананда Васу и Сатьяраджа.</w:t>
+      </w:r>
+    </w:p>
+    <w:p>
+      <w:pPr>
+        <w:spacing w:after="60"/>
+        <w:ind w:left="510" w:hanging="510"/>
+      </w:pPr>
+      <w:r>
+        <w:rPr>
+          <w:b/>
+          <w:i w:val="0"/>
+        </w:rPr>
+        <w:t>174.</w:t>
+      </w:r>
+      <w:r>
+        <w:t xml:space="preserve"> Та, что во Врадже была Катьяяни, ныне — Шри Канта Сена.</w:t>
+      </w:r>
+    </w:p>
+    <w:p>
+      <w:pPr>
+        <w:spacing w:after="60"/>
+        <w:ind w:left="510" w:hanging="510"/>
+      </w:pPr>
+      <w:r>
+        <w:rPr>
+          <w:b/>
+          <w:i w:val="0"/>
+        </w:rPr>
+        <w:t>175.</w:t>
+      </w:r>
+      <w:r>
+        <w:t xml:space="preserve"> Распорядительница Враджа по имени Вринда-деви — это ныне Шри Мукунда Дас из Кханды, любимец Прабху.</w:t>
+      </w:r>
+    </w:p>
+    <w:p>
+      <w:pPr>
+        <w:spacing w:after="60"/>
+        <w:ind w:left="510" w:hanging="510"/>
+      </w:pPr>
+      <w:r>
+        <w:rPr>
+          <w:b/>
+          <w:i w:val="0"/>
+        </w:rPr>
+        <w:t>176.</w:t>
+      </w:r>
+      <w:r>
+        <w:t xml:space="preserve"> Посланница Вира, что некогда во Вриндаване приводила всех гопи к Кришне, — это ныне мой отец; та, что во Врадже была Биндумати, — это ныне моя мать.</w:t>
+      </w:r>
+    </w:p>
+    <w:p>
+      <w:pPr>
+        <w:spacing w:after="60"/>
+        <w:ind w:left="510" w:hanging="510"/>
+      </w:pPr>
+      <w:r>
+        <w:rPr>
+          <w:b/>
+          <w:i w:val="0"/>
+        </w:rPr>
+        <w:t>177.</w:t>
+      </w:r>
+      <w:r>
+        <w:t xml:space="preserve"> Мадхумати, некогда задушевная подруга во Вриндаване, ныне — Нарахари Саркар, любимец Прабху.</w:t>
+      </w:r>
+    </w:p>
+    <w:p>
+      <w:pPr>
+        <w:spacing w:after="60"/>
+        <w:ind w:left="510" w:hanging="510"/>
+      </w:pPr>
+      <w:r>
+        <w:rPr>
+          <w:b/>
+          <w:i w:val="0"/>
+        </w:rPr>
+        <w:t>178.</w:t>
+      </w:r>
+      <w:r>
+        <w:t xml:space="preserve"> Задушевная подруга во Врадже по имени Ратнавали — это Гопинатха Ачарья, прославленный чистотой.</w:t>
+      </w:r>
+    </w:p>
+    <w:p>
+      <w:pPr>
+        <w:spacing w:after="60"/>
+        <w:ind w:left="510" w:hanging="510"/>
+      </w:pPr>
+      <w:r>
+        <w:rPr>
+          <w:b/>
+          <w:i w:val="0"/>
+        </w:rPr>
+        <w:t>179.</w:t>
+      </w:r>
+      <w:r>
+        <w:t xml:space="preserve"> Флейта, любимица Кришны, — это Вамши Дас Тхакур</w:t>
+      </w:r>
+      <w:r>
+        <w:rPr>
+          <w:b w:val="0"/>
+          <w:i w:val="0"/>
+          <w:vertAlign w:val="superscript"/>
+        </w:rPr>
+        <w:t>48</w:t>
+      </w:r>
+      <w:r>
+        <w:t>.</w:t>
+      </w:r>
+    </w:p>
+    <w:p>
+      <w:pPr>
+        <w:pStyle w:val="Heading2"/>
+      </w:pPr>
+      <w:r>
+        <w:t>Манджари</w:t>
+      </w:r>
+    </w:p>
+    <w:p>
+      <w:pPr>
+        <w:spacing w:after="60"/>
+        <w:ind w:left="510" w:hanging="510"/>
+      </w:pPr>
+      <w:r>
+        <w:rPr>
+          <w:b/>
+          <w:i w:val="0"/>
+        </w:rPr>
+        <w:t>180.</w:t>
+      </w:r>
+      <w:r>
+        <w:t xml:space="preserve"> Шри Рупа-манджари, прославленная некогда во Вриндаване, ныне явилась, став Рупой Госвами.</w:t>
+      </w:r>
+    </w:p>
+    <w:p>
+      <w:pPr>
+        <w:spacing w:after="60"/>
+        <w:ind w:left="510" w:hanging="510"/>
+      </w:pPr>
+      <w:r>
+        <w:rPr>
+          <w:b/>
+          <w:i w:val="0"/>
+        </w:rPr>
+        <w:t>181.</w:t>
+      </w:r>
+      <w:r>
+        <w:t xml:space="preserve"> Рати-манджари, любимейшая подруга Рупа-манджари, мудрыми называется также по-иному — Лаванга-манджари.</w:t>
+      </w:r>
+    </w:p>
+    <w:p>
+      <w:pPr>
+        <w:spacing w:after="60"/>
+        <w:ind w:left="510" w:hanging="510"/>
+      </w:pPr>
+      <w:r>
+        <w:rPr>
+          <w:b/>
+          <w:i w:val="0"/>
+        </w:rPr>
+        <w:t>182.</w:t>
+      </w:r>
+      <w:r>
+        <w:t xml:space="preserve"> Она ныне — Санатана, неотличный по телу от Гауры, достойный почитания всеми; ради дела в него вошёл и Санатана, драгоценность среди мудрецов</w:t>
+      </w:r>
+      <w:r>
+        <w:rPr>
+          <w:b w:val="0"/>
+          <w:i w:val="0"/>
+          <w:vertAlign w:val="superscript"/>
+        </w:rPr>
+        <w:t>49</w:t>
+      </w:r>
+      <w:r>
+        <w:t>.</w:t>
+      </w:r>
+    </w:p>
+    <w:p>
+      <w:pPr>
+        <w:spacing w:after="60"/>
+        <w:ind w:left="510" w:hanging="510"/>
+      </w:pPr>
+      <w:r>
+        <w:rPr>
+          <w:b/>
+          <w:i w:val="0"/>
+        </w:rPr>
+        <w:t>183.</w:t>
+      </w:r>
+      <w:r>
+        <w:t xml:space="preserve"> Как проявление Шримати Лаванга-манджари прославлен Шивананда Чакраварти, поселившийся во Вриндаване.</w:t>
+      </w:r>
+    </w:p>
+    <w:p>
+      <w:pPr>
+        <w:spacing w:after="60"/>
+        <w:ind w:left="510" w:hanging="510"/>
+      </w:pPr>
+      <w:r>
+        <w:rPr>
+          <w:b/>
+          <w:i w:val="0"/>
+        </w:rPr>
+        <w:t>184.</w:t>
+      </w:r>
+      <w:r>
+        <w:t xml:space="preserve"> Ананга-манджари — ныне Гопала Бхатта; иные же называют Бхатту Госвами Шри Гуна-манджари.</w:t>
+      </w:r>
+    </w:p>
+    <w:p>
+      <w:pPr>
+        <w:spacing w:after="60"/>
+        <w:ind w:left="510" w:hanging="510"/>
+      </w:pPr>
+      <w:r>
+        <w:rPr>
+          <w:b/>
+          <w:i w:val="0"/>
+        </w:rPr>
+        <w:t>185.</w:t>
+      </w:r>
+      <w:r>
+        <w:t xml:space="preserve"> Рагхунатха Бхатта — это прежняя Рага-манджари. А тот, кто поселился в хижине у Шри Радха-кунды, —</w:t>
+      </w:r>
+    </w:p>
+    <w:p>
+      <w:pPr>
+        <w:spacing w:after="60"/>
+        <w:ind w:left="510" w:hanging="510"/>
+      </w:pPr>
+      <w:r>
+        <w:rPr>
+          <w:b/>
+          <w:i w:val="0"/>
+        </w:rPr>
+        <w:t>186.</w:t>
+      </w:r>
+      <w:r>
+        <w:t xml:space="preserve"> это Рагхунатха Дас, чьё прежнее имя — Раса-манджари; некоторые называют его Шримати Рати-манджари, а иные, по различию имён, — Бханумати.</w:t>
+      </w:r>
+    </w:p>
+    <w:p>
+      <w:pPr>
+        <w:spacing w:after="60"/>
+        <w:ind w:left="510" w:hanging="510"/>
+      </w:pPr>
+      <w:r>
+        <w:rPr>
+          <w:b/>
+          <w:i w:val="0"/>
+        </w:rPr>
+        <w:t>187.</w:t>
+      </w:r>
+      <w:r>
+        <w:t xml:space="preserve"> Прежнее имя Бхугарбхи Тхакура — Према-манджари; Локанатха Госвами — прежняя Шри Лила-манджари.</w:t>
+      </w:r>
+    </w:p>
+    <w:p>
+      <w:pPr>
+        <w:spacing w:after="60"/>
+        <w:ind w:left="510" w:hanging="510"/>
+      </w:pPr>
+      <w:r>
+        <w:rPr>
+          <w:b/>
+          <w:i w:val="0"/>
+        </w:rPr>
+        <w:t>188.</w:t>
+      </w:r>
+      <w:r>
+        <w:t xml:space="preserve"> Калавати, Расолласа и Гунатунга, бывшие во Врадже и певшие песни, сложенные Шри Вишакхой, считаются ныне, соответственно, Говиндой, Мадхаванандой и Васудевой</w:t>
+      </w:r>
+      <w:r>
+        <w:rPr>
+          <w:b w:val="0"/>
+          <w:i w:val="0"/>
+          <w:vertAlign w:val="superscript"/>
+        </w:rPr>
+        <w:t>50</w:t>
+      </w:r>
+      <w:r>
+        <w:t>.</w:t>
+      </w:r>
+    </w:p>
+    <w:p>
+      <w:pPr>
+        <w:spacing w:after="60"/>
+        <w:ind w:left="510" w:hanging="510"/>
+      </w:pPr>
+      <w:r>
+        <w:rPr>
+          <w:b/>
+          <w:i w:val="0"/>
+        </w:rPr>
+        <w:t>189.</w:t>
+      </w:r>
+      <w:r>
+        <w:t xml:space="preserve"> Рагалекха и Калакели, служанки Радхи, — это, соответственно, Шикхи Махити и его сестра Мадхави.</w:t>
+      </w:r>
+    </w:p>
+    <w:p>
+      <w:pPr>
+        <w:spacing w:after="60"/>
+        <w:ind w:left="510" w:hanging="510"/>
+      </w:pPr>
+      <w:r>
+        <w:rPr>
+          <w:b/>
+          <w:i w:val="0"/>
+        </w:rPr>
+        <w:t>190.</w:t>
+      </w:r>
+      <w:r>
+        <w:t xml:space="preserve"> Дочь пулинды Малли ныне стала Калидасом</w:t>
+      </w:r>
+      <w:r>
+        <w:rPr>
+          <w:b w:val="0"/>
+          <w:i w:val="0"/>
+          <w:vertAlign w:val="superscript"/>
+        </w:rPr>
+        <w:t>51</w:t>
+      </w:r>
+      <w:r>
+        <w:t>.</w:t>
+      </w:r>
+    </w:p>
+    <w:p>
+      <w:pPr>
+        <w:spacing w:after="60"/>
+        <w:ind w:left="510" w:hanging="510"/>
+      </w:pPr>
+      <w:r>
+        <w:rPr>
+          <w:b/>
+          <w:i w:val="0"/>
+        </w:rPr>
+        <w:t>191.</w:t>
+      </w:r>
+      <w:r>
+        <w:t xml:space="preserve"> Шукламбара Брахмачари, чью пищу, попросив, ел Прабху Гауранга, прежде была женой жреца. Некоторые говорят, что Брахмачари прежде был брахманом-жрецом.</w:t>
+      </w:r>
+    </w:p>
+    <w:p>
+      <w:pPr>
+        <w:spacing w:after="60"/>
+        <w:ind w:left="510" w:hanging="510"/>
+      </w:pPr>
+      <w:r>
+        <w:rPr>
+          <w:b/>
+          <w:i w:val="0"/>
+        </w:rPr>
+        <w:t>192.</w:t>
+      </w:r>
+      <w:r>
+        <w:t xml:space="preserve"> Другие жёны жрецов — Шри Джагадиша и Хираньяка, у которых Прабху в экадаши, попросив, ел пищу.</w:t>
+      </w:r>
+    </w:p>
+    <w:p>
+      <w:pPr>
+        <w:spacing w:after="60"/>
+        <w:ind w:left="510" w:hanging="510"/>
+      </w:pPr>
+      <w:r>
+        <w:rPr>
+          <w:b/>
+          <w:i w:val="0"/>
+        </w:rPr>
+        <w:t>193.</w:t>
+      </w:r>
+      <w:r>
+        <w:t xml:space="preserve"> Сайрандхри, некогда возлюбленная Кришны в Матхуре, ныне — живущий в Нилачале Каши Мишра, любимец Прабху.</w:t>
+      </w:r>
+    </w:p>
+    <w:p>
+      <w:pPr>
+        <w:spacing w:after="60"/>
+        <w:jc w:val="both"/>
+      </w:pPr>
+      <w:r>
+        <w:rPr>
+          <w:b/>
+          <w:i w:val="0"/>
+        </w:rPr>
+        <w:t>194–207.</w:t>
+      </w:r>
+      <w:r>
+        <w:t xml:space="preserve"> Малати, Чандралатика, Манджумедха, Варангада, Ратнавали, Камала, Гуначуда, Сукешини, Карпура-манджари, Шьяма-манджари, Швета-манджари, Виласа-манджари, Камалекха, Мауна-манджари, Гандхонмада, Расонмада, Чандрика, Калабхашини, Гопали, Харини, Кали, Калакши, Нитья-манджари, Калаканти, Курангакши, Чандрика и Чандрашекхара — все те, кого Радха поставила на подобающее каждой служение, — приняв мужские тела, по своей природе играли вместе с Гаурой и его любимцами, по порядку так: брахман Шубхананда; Шридхара Брахмачари; Парамананда Гупта, составивший «Кришна-стававали»; некий брахман Рагхунатха, служащий одному Гауранге; Камсари Сена; почтенный Шри Джаганнатха Сена; Субуддхи Мишра; Шри Харша; Рагху Мишра, лучший из брахманов; Джитамитра — достойный своего имени, ибо им побеждены и подчинены шесть врагов во главе с вожделением, — так назвал его Гаура; составивший книжку «Кришна-према-тарангини» Шримад-Бхагаватачарья, крайне любимый Гаурангой; благонравный учёный Шриман Джива, сын Шри Валлабхи; брахман Ванинатха из Чампахатты, любимец Прабху; Ишана Ачарья и Камала; Пандит по имени Лакшминатха; Гангамантри; Джаганнатха по прозванию Маму, лучший из брахманов; Ананта из рода Чаттов по прозванию Кантхабхарана; Хасти-Гопала; Валлабха из Ранги; Хари Ачарья, спутник Гауры; Шри Наяна Мишра; Кавидатта; Рамадас; Чиранджива и Сулочана</w:t>
+      </w:r>
+      <w:r>
+        <w:rPr>
+          <w:b w:val="0"/>
+          <w:i w:val="0"/>
+          <w:vertAlign w:val="superscript"/>
+        </w:rPr>
+        <w:t>52</w:t>
+      </w:r>
+      <w:r>
+        <w:t>.</w:t>
+      </w:r>
+    </w:p>
+    <w:p>
+      <w:pPr>
+        <w:pStyle w:val="Heading2"/>
+      </w:pPr>
+      <w:r>
+        <w:t>Заключение</w:t>
+      </w:r>
+    </w:p>
+    <w:p>
+      <w:pPr>
+        <w:spacing w:after="60"/>
+        <w:ind w:left="510" w:hanging="510"/>
+      </w:pPr>
+      <w:r>
+        <w:rPr>
+          <w:b/>
+          <w:i w:val="0"/>
+        </w:rPr>
+        <w:t>208.</w:t>
+      </w:r>
+      <w:r>
+        <w:t xml:space="preserve"> Одни из них — маханты, другие — упа-маханты; достоинства тех и других равны, поэтому я перечислил их вместе.</w:t>
+      </w:r>
+    </w:p>
+    <w:p>
+      <w:pPr>
+        <w:spacing w:after="60"/>
+        <w:ind w:left="510" w:hanging="510"/>
+      </w:pPr>
+      <w:r>
+        <w:rPr>
+          <w:b/>
+          <w:i w:val="0"/>
+        </w:rPr>
+        <w:t>209.</w:t>
+      </w:r>
+      <w:r>
+        <w:t xml:space="preserve"> Чиранджива и Сулочана, живущие в Кханде, благодаря общению с Нарахари стоят выше; их единственное прибежище — Гауранга.</w:t>
+      </w:r>
+    </w:p>
+    <w:p>
+      <w:pPr>
+        <w:spacing w:after="60"/>
+        <w:ind w:left="510" w:hanging="510"/>
+      </w:pPr>
+      <w:r>
+        <w:rPr>
+          <w:b/>
+          <w:i w:val="0"/>
+        </w:rPr>
+        <w:t>210.</w:t>
+      </w:r>
+      <w:r>
+        <w:t xml:space="preserve"> Согласно шастре, что гласит: «не следует произносить имени гуру», я не открыл прежнего имени Шри Шринатхи.</w:t>
+      </w:r>
+    </w:p>
+    <w:p>
+      <w:pPr>
+        <w:spacing w:after="60"/>
+        <w:ind w:left="510" w:hanging="510"/>
+      </w:pPr>
+      <w:r>
+        <w:rPr>
+          <w:b/>
+          <w:i w:val="0"/>
+        </w:rPr>
+        <w:t>211.</w:t>
+      </w:r>
+      <w:r>
+        <w:t xml:space="preserve"> Он искусно истолковал «Бхагавата-самхиту»; его слава — Кришнадева, сияющий в Кумарахатте</w:t>
+      </w:r>
+      <w:r>
+        <w:rPr>
+          <w:b w:val="0"/>
+          <w:i w:val="0"/>
+          <w:vertAlign w:val="superscript"/>
+        </w:rPr>
+        <w:t>53</w:t>
+      </w:r>
+      <w:r>
+        <w:t>.</w:t>
+      </w:r>
+    </w:p>
+    <w:p>
+      <w:pPr>
+        <w:spacing w:after="60"/>
+        <w:ind w:left="510" w:hanging="510"/>
+      </w:pPr>
+      <w:r>
+        <w:rPr>
+          <w:b/>
+          <w:i w:val="0"/>
+        </w:rPr>
+        <w:t>212.</w:t>
+      </w:r>
+      <w:r>
+        <w:t xml:space="preserve"> Пусть маханты, порядок упоминания которых нарушен, милостиво простят мне эту оплошность: даже Брахма, Шива и Шеша не в силах перечислить все достоинства святых.</w:t>
+      </w:r>
+    </w:p>
+    <w:p>
+      <w:pPr>
+        <w:spacing w:after="60"/>
+        <w:ind w:left="510" w:hanging="510"/>
+      </w:pPr>
+      <w:r>
+        <w:rPr>
+          <w:b/>
+          <w:i w:val="0"/>
+        </w:rPr>
+        <w:t>213.</w:t>
+      </w:r>
+      <w:r>
+        <w:t xml:space="preserve"> Эту книгу следует старательно скрывать от мимансаков, от лукавых спорщиков и особенно от тех, кто ищет одних доводов; её всегда следует давать знатокам шастр о расе, прибегшим к стопам Гауры.</w:t>
+      </w:r>
+    </w:p>
+    <w:p>
+      <w:pPr>
+        <w:spacing w:after="60"/>
+        <w:ind w:left="510" w:hanging="510"/>
+      </w:pPr>
+      <w:r>
+        <w:rPr>
+          <w:b/>
+          <w:i w:val="0"/>
+        </w:rPr>
+        <w:t>214.</w:t>
+      </w:r>
+      <w:r>
+        <w:t xml:space="preserve"> Эта «Шри Гаура-ганоддеша-дипика» составлена мной; да светит она в доме преданных, исполненном высшего блаженства.</w:t>
+      </w:r>
+    </w:p>
+    <w:p>
+      <w:pPr>
+        <w:spacing w:after="60"/>
+        <w:ind w:left="510" w:hanging="510"/>
+      </w:pPr>
+      <w:r>
+        <w:rPr>
+          <w:b/>
+          <w:i w:val="0"/>
+        </w:rPr>
+        <w:t>215.</w:t>
+      </w:r>
+      <w:r>
+        <w:t xml:space="preserve"> В году Шака, отмеренном числами «Васу», «Граха» и «Ману»</w:t>
+      </w:r>
+      <w:r>
+        <w:rPr>
+          <w:b w:val="0"/>
+          <w:i w:val="0"/>
+          <w:vertAlign w:val="superscript"/>
+        </w:rPr>
+        <w:t>55</w:t>
+      </w:r>
+      <w:r>
+        <w:t>, в некий день явилась эта книга. Пусть мудрые, чьи сердца погружены в нектар деяний Чайтанья-чандры, исправят её — это перечисление спутников Гауры.</w:t>
+      </w:r>
+    </w:p>
+    <w:p>
+      <w:pPr>
+        <w:spacing w:after="60"/>
+        <w:jc w:val="both"/>
+      </w:pPr>
+      <w:r>
+        <w:rPr>
+          <w:b w:val="0"/>
+          <w:i/>
+        </w:rPr>
+        <w:t>Так заканчивается «Шри Гаура-ганоддеша-дипика», составленная Кави Карнапурой, называемым также Пуридасом и Парамананда Дасом.</w:t>
+      </w:r>
+    </w:p>
+    <w:p>
+      <w:pPr>
+        <w:pStyle w:val="Heading3"/>
+      </w:pPr>
+      <w:r>
+        <w:t>Примечания переводчика</w:t>
+      </w:r>
+    </w:p>
+    <w:p>
       <w:pPr>
         <w:spacing w:after="60"/>
         <w:ind w:left="283"/>
@@ -3467,1872 +5005,253 @@
           <w:i w:val="0"/>
           <w:sz w:val="18"/>
         </w:rPr>
-        <w:t>38.</w:t>
+        <w:t>39.</w:t>
       </w:r>
       <w:r>
         <w:rPr>
           <w:sz w:val="18"/>
         </w:rPr>
-        <w:t xml:space="preserve"> Бхавананда Рай, отец Рамананды; Притхапати — «супруг Притхи», т. е. Панду.</w:t>
+        <w:t xml:space="preserve"> То есть в Рамананде соединились трое: друг-наперсник Арджуна, Арджуна-Пандава и гопи Арджуния (Лалита, по мнению некоторых).</w:t>
       </w:r>
     </w:p>
     <w:p>
-      <w:r>
-        <w:br w:type="page"/>
+      <w:pPr>
+        <w:spacing w:after="60"/>
+        <w:ind w:left="283"/>
+      </w:pPr>
+      <w:r>
+        <w:rPr>
+          <w:b/>
+          <w:i w:val="0"/>
+          <w:sz w:val="18"/>
+        </w:rPr>
+        <w:t>40.</w:t>
+      </w:r>
+      <w:r>
+        <w:rPr>
+          <w:sz w:val="18"/>
+        </w:rPr>
+        <w:t xml:space="preserve"> Сундарананда Тхакур.</w:t>
       </w:r>
     </w:p>
     <w:p>
       <w:pPr>
-        <w:pStyle w:val="Heading1"/>
-        <w:jc w:val="center"/>
-      </w:pPr>
-      <w:r>
-        <w:t>Часть 3</w:t>
+        <w:spacing w:after="60"/>
+        <w:ind w:left="283"/>
+      </w:pPr>
+      <w:r>
+        <w:rPr>
+          <w:b/>
+          <w:i w:val="0"/>
+          <w:sz w:val="18"/>
+        </w:rPr>
+        <w:t>41.</w:t>
+      </w:r>
+      <w:r>
+        <w:rPr>
+          <w:sz w:val="18"/>
+        </w:rPr>
+        <w:t xml:space="preserve"> «Кхола-веча» — продавец банановой кожуры (утвари из банановых листьев), Шридхара из «Чайтанья-бхагаваты».</w:t>
       </w:r>
     </w:p>
     <w:p>
       <w:pPr>
         <w:spacing w:after="60"/>
-        <w:jc w:val="both"/>
-      </w:pPr>
-      <w:r>
-        <w:rPr>
-          <w:b w:val="0"/>
-          <w:i/>
-        </w:rPr>
-        <w:t>Друзья-пастушки Враджа. Слуги и музыканты. Гопи: Гададхара и Лалита, восемь сакхи и другие. Манджари и Госвами Вриндаваны. Заключение (шлоки 124–215)</w:t>
+        <w:ind w:left="283"/>
+      </w:pPr>
+      <w:r>
+        <w:rPr>
+          <w:b/>
+          <w:i w:val="0"/>
+          <w:sz w:val="18"/>
+        </w:rPr>
+        <w:t>42.</w:t>
+      </w:r>
+      <w:r>
+        <w:rPr>
+          <w:sz w:val="18"/>
+        </w:rPr>
+        <w:t xml:space="preserve"> Не путать с Харидасом Тхакуром.</w:t>
       </w:r>
     </w:p>
     <w:p>
       <w:pPr>
         <w:spacing w:after="60"/>
-        <w:ind w:left="510" w:hanging="510"/>
+        <w:ind w:left="283"/>
       </w:pPr>
       <w:r>
         <w:rPr>
           <w:b/>
           <w:i w:val="0"/>
-        </w:rPr>
-        <w:t>124.</w:t>
-      </w:r>
-      <w:r>
-        <w:t xml:space="preserve"> «Гопи Арджуния тотчас стала и Арджуной, сыном Панду», — это ясно сказано в «Падма-уттара-кханде». Поэтому почтенный Рамананда Рай — эти трое</w:t>
-      </w:r>
-      <w:r>
-        <w:rPr>
-          <w:b w:val="0"/>
-          <w:i w:val="0"/>
-          <w:vertAlign w:val="superscript"/>
-        </w:rPr>
-        <w:t>39</w:t>
-      </w:r>
-      <w:r>
-        <w:t>.</w:t>
+          <w:sz w:val="18"/>
+        </w:rPr>
+        <w:t>43.</w:t>
+      </w:r>
+      <w:r>
+        <w:rPr>
+          <w:sz w:val="18"/>
+        </w:rPr>
+        <w:t xml:space="preserve"> Чайтанья Дас и Рамадас — старшие братья автора, сыновья Шивананды Сена.</w:t>
       </w:r>
     </w:p>
     <w:p>
       <w:pPr>
-        <w:pStyle w:val="Heading2"/>
-      </w:pPr>
-      <w:r>
-        <w:t>Друзья-пастушки</w:t>
+        <w:spacing w:after="60"/>
+        <w:ind w:left="283"/>
+      </w:pPr>
+      <w:r>
+        <w:rPr>
+          <w:b/>
+          <w:i w:val="0"/>
+          <w:sz w:val="18"/>
+        </w:rPr>
+        <w:t>44.</w:t>
+      </w:r>
+      <w:r>
+        <w:rPr>
+          <w:sz w:val="18"/>
+        </w:rPr>
+        <w:t xml:space="preserve"> Гададхара Дас.</w:t>
       </w:r>
     </w:p>
     <w:p>
       <w:pPr>
         <w:spacing w:after="60"/>
-        <w:ind w:left="510" w:hanging="510"/>
+        <w:ind w:left="283"/>
       </w:pPr>
       <w:r>
         <w:rPr>
           <w:b/>
           <w:i w:val="0"/>
-        </w:rPr>
-        <w:t>125.</w:t>
-      </w:r>
-      <w:r>
-        <w:t xml:space="preserve"> Теперь кратко, по моему разумению, называются преданные из Враджа.</w:t>
+          <w:sz w:val="18"/>
+        </w:rPr>
+        <w:t>45.</w:t>
+      </w:r>
+      <w:r>
+        <w:rPr>
+          <w:sz w:val="18"/>
+        </w:rPr>
+        <w:t xml:space="preserve"> «Чанди» — «гневливая, резкая»: Дамодара Пандит известен прямотой, с которой делал замечания даже Махапрабху.</w:t>
       </w:r>
     </w:p>
     <w:p>
       <w:pPr>
         <w:spacing w:after="60"/>
-        <w:ind w:left="510" w:hanging="510"/>
+        <w:ind w:left="283"/>
       </w:pPr>
       <w:r>
         <w:rPr>
           <w:b/>
           <w:i w:val="0"/>
-        </w:rPr>
-        <w:t>126.</w:t>
-      </w:r>
-      <w:r>
-        <w:t xml:space="preserve"> Тот, кто прежде звался Шридамой, ныне — великий Абхирама; это он нёс бревно, которое могли поднять лишь тридцать два человека.</w:t>
+          <w:sz w:val="18"/>
+        </w:rPr>
+        <w:t>48.</w:t>
+      </w:r>
+      <w:r>
+        <w:rPr>
+          <w:sz w:val="18"/>
+        </w:rPr>
+        <w:t xml:space="preserve"> Вамшивадана Тхакур — по традиции, воплощение флейты Кришны.</w:t>
       </w:r>
     </w:p>
     <w:p>
       <w:pPr>
         <w:spacing w:after="60"/>
-        <w:ind w:left="510" w:hanging="510"/>
+        <w:ind w:left="283"/>
       </w:pPr>
       <w:r>
         <w:rPr>
           <w:b/>
           <w:i w:val="0"/>
-        </w:rPr>
-        <w:t>127.</w:t>
-      </w:r>
-      <w:r>
-        <w:t xml:space="preserve"> Тот, кто прежде звался Судамой, ныне — Тхакур Сундара</w:t>
-      </w:r>
-      <w:r>
-        <w:rPr>
-          <w:b w:val="0"/>
-          <w:i w:val="0"/>
-          <w:vertAlign w:val="superscript"/>
-        </w:rPr>
-        <w:t>40</w:t>
-      </w:r>
-      <w:r>
-        <w:t>; друг Васудама — это Пандит Шри Дхананджая.</w:t>
+          <w:sz w:val="18"/>
+        </w:rPr>
+        <w:t>49.</w:t>
+      </w:r>
+      <w:r>
+        <w:rPr>
+          <w:sz w:val="18"/>
+        </w:rPr>
+        <w:t xml:space="preserve"> Второй «Санатана» — мудрец Санатана-кумара.</w:t>
       </w:r>
     </w:p>
     <w:p>
       <w:pPr>
         <w:spacing w:after="60"/>
-        <w:ind w:left="510" w:hanging="510"/>
+        <w:ind w:left="283"/>
       </w:pPr>
       <w:r>
         <w:rPr>
           <w:b/>
           <w:i w:val="0"/>
-        </w:rPr>
-        <w:t>128.</w:t>
-      </w:r>
-      <w:r>
-        <w:t xml:space="preserve"> Субала, лучший из любимых друзей, — это Гаури Дас Пандит; могучий Махабала — это Камалакара Пиппалаи.</w:t>
+          <w:sz w:val="18"/>
+        </w:rPr>
+        <w:t>50.</w:t>
+      </w:r>
+      <w:r>
+        <w:rPr>
+          <w:sz w:val="18"/>
+        </w:rPr>
+        <w:t xml:space="preserve"> Говинда, Мадхава и Васудева Гхош — братья-киртании.</w:t>
       </w:r>
     </w:p>
     <w:p>
       <w:pPr>
         <w:spacing w:after="60"/>
-        <w:ind w:left="510" w:hanging="510"/>
+        <w:ind w:left="283"/>
       </w:pPr>
       <w:r>
         <w:rPr>
           <w:b/>
           <w:i w:val="0"/>
-        </w:rPr>
-        <w:t>129.</w:t>
-      </w:r>
-      <w:r>
-        <w:t xml:space="preserve"> Пастух Враджа Субаху — это Уддхарана Датта; друг во Врадже Махабаху — это Шриман Махеша Пандит.</w:t>
+          <w:sz w:val="18"/>
+        </w:rPr>
+        <w:t>51.</w:t>
+      </w:r>
+      <w:r>
+        <w:rPr>
+          <w:sz w:val="18"/>
+        </w:rPr>
+        <w:t xml:space="preserve"> Калидас — дядя Рагхунатхи Даса, известный тем, что собирал остатки пищи у всех вайшнавов.</w:t>
       </w:r>
     </w:p>
     <w:p>
       <w:pPr>
         <w:spacing w:after="60"/>
-        <w:ind w:left="510" w:hanging="510"/>
+        <w:ind w:left="283"/>
       </w:pPr>
       <w:r>
         <w:rPr>
           <w:b/>
           <w:i w:val="0"/>
-        </w:rPr>
-        <w:t>130.</w:t>
-      </w:r>
-      <w:r>
-        <w:t xml:space="preserve"> Прежний друг Стокакришна — это Шри Пурушоттама Дас.</w:t>
+          <w:sz w:val="18"/>
+        </w:rPr>
+        <w:t>52.</w:t>
+      </w:r>
+      <w:r>
+        <w:rPr>
+          <w:sz w:val="18"/>
+        </w:rPr>
+        <w:t xml:space="preserve"> Издание объединяет шлоки 194–207 в одну группу; соответствие имён гопи и спутников Гауры дано по порядку перечисления.</w:t>
       </w:r>
     </w:p>
     <w:p>
       <w:pPr>
         <w:spacing w:after="60"/>
-        <w:ind w:left="510" w:hanging="510"/>
+        <w:ind w:left="283"/>
       </w:pPr>
       <w:r>
         <w:rPr>
           <w:b/>
           <w:i w:val="0"/>
-        </w:rPr>
-        <w:t>131.</w:t>
-      </w:r>
-      <w:r>
-        <w:t xml:space="preserve"> Сын Садашивы по имени Нагара Пурушоттама, родившийся в роду вайдьев, — это пастух Враджа Дама.</w:t>
-      </w:r>
-    </w:p>
-    <w:p>
-      <w:pPr>
-        <w:spacing w:after="60"/>
-        <w:ind w:left="510" w:hanging="510"/>
-      </w:pPr>
-      <w:r>
-        <w:rPr>
-          <w:b/>
-          <w:i w:val="0"/>
-        </w:rPr>
-        <w:t>132.</w:t>
-      </w:r>
-      <w:r>
-        <w:t xml:space="preserve"> Прежний друг по имени Арджуна — это Шри Парамешвара Дас; друг Враджа Лаванга — это Кала Кришнадас.</w:t>
-      </w:r>
-    </w:p>
-    <w:p>
-      <w:pPr>
-        <w:spacing w:after="60"/>
-        <w:ind w:left="510" w:hanging="510"/>
-      </w:pPr>
-      <w:r>
-        <w:rPr>
-          <w:b/>
-          <w:i w:val="0"/>
-        </w:rPr>
-        <w:t>133.</w:t>
-      </w:r>
-      <w:r>
-        <w:t xml:space="preserve"> Брахман Шридхара Пандит, известный как Кхола-веча</w:t>
-      </w:r>
-      <w:r>
-        <w:rPr>
-          <w:b w:val="0"/>
-          <w:i w:val="0"/>
-          <w:vertAlign w:val="superscript"/>
-        </w:rPr>
-        <w:t>41</w:t>
-      </w:r>
-      <w:r>
-        <w:t>, был во Врадже шутником по имени Кусумасава.</w:t>
-      </w:r>
-    </w:p>
-    <w:p>
-      <w:pPr>
-        <w:spacing w:after="60"/>
-        <w:ind w:left="510" w:hanging="510"/>
-      </w:pPr>
-      <w:r>
-        <w:rPr>
-          <w:b/>
-          <w:i w:val="0"/>
-        </w:rPr>
-        <w:t>134.</w:t>
-      </w:r>
-      <w:r>
-        <w:t xml:space="preserve"> Некий могучий пастушок, друг Баларамы, бывший прежде во Врадже, — это ныне Халаюдха Тхакур.</w:t>
-      </w:r>
-    </w:p>
-    <w:p>
-      <w:pPr>
-        <w:spacing w:after="60"/>
-        <w:ind w:left="510" w:hanging="510"/>
-      </w:pPr>
-      <w:r>
-        <w:rPr>
-          <w:b/>
-          <w:i w:val="0"/>
-        </w:rPr>
-        <w:t>135.</w:t>
-      </w:r>
-      <w:r>
-        <w:t xml:space="preserve"> Друг Кришначандры во Врадже по имени Варутхапа — это Рудра Пандит, любимец Гауранги.</w:t>
-      </w:r>
-    </w:p>
-    <w:p>
-      <w:pPr>
-        <w:spacing w:after="60"/>
-        <w:ind w:left="510" w:hanging="510"/>
-      </w:pPr>
-      <w:r>
-        <w:rPr>
-          <w:b/>
-          <w:i w:val="0"/>
-        </w:rPr>
-        <w:t>136.</w:t>
-      </w:r>
-      <w:r>
-        <w:t xml:space="preserve"> Пастух Враджа Гандхарва — это Кумудананда Пандит.</w:t>
-      </w:r>
-    </w:p>
-    <w:p>
-      <w:pPr>
-        <w:pStyle w:val="Heading2"/>
-      </w:pPr>
-      <w:r>
-        <w:t>Слуги, певцы и музыканты</w:t>
-      </w:r>
-    </w:p>
-    <w:p>
-      <w:pPr>
-        <w:spacing w:after="60"/>
-        <w:ind w:left="510" w:hanging="510"/>
-      </w:pPr>
-      <w:r>
-        <w:rPr>
-          <w:b/>
-          <w:i w:val="0"/>
-        </w:rPr>
-        <w:t>137.</w:t>
-      </w:r>
-      <w:r>
-        <w:t xml:space="preserve"> Два слуги во Вриндаване, Бхрингара и Бхангура, родились слугами Прабху — Шри Кашишварой и Говиндой.</w:t>
-      </w:r>
-    </w:p>
-    <w:p>
-      <w:pPr>
-        <w:spacing w:after="60"/>
-        <w:ind w:left="510" w:hanging="510"/>
-      </w:pPr>
-      <w:r>
-        <w:rPr>
-          <w:b/>
-          <w:i w:val="0"/>
-        </w:rPr>
-        <w:t>138.</w:t>
-      </w:r>
-      <w:r>
-        <w:t xml:space="preserve"> Два слуги во Вриндаване, Рактака и Патрака, ныне служат Гауранге — это Харидас Старший и Харидас Младший</w:t>
-      </w:r>
-      <w:r>
-        <w:rPr>
-          <w:b w:val="0"/>
-          <w:i w:val="0"/>
-          <w:vertAlign w:val="superscript"/>
-        </w:rPr>
-        <w:t>42</w:t>
-      </w:r>
-      <w:r>
-        <w:t>.</w:t>
-      </w:r>
-    </w:p>
-    <w:p>
-      <w:pPr>
-        <w:spacing w:after="60"/>
-        <w:ind w:left="510" w:hanging="510"/>
-      </w:pPr>
-      <w:r>
-        <w:rPr>
-          <w:b/>
-          <w:i w:val="0"/>
-        </w:rPr>
-        <w:t>139.</w:t>
-      </w:r>
-      <w:r>
-        <w:t xml:space="preserve"> Двое, Пайода и Варида, прежде готовившие воду, ныне известны как слуги Рамаи и Нандаи.</w:t>
-      </w:r>
-    </w:p>
-    <w:p>
-      <w:pPr>
-        <w:spacing w:after="60"/>
-        <w:ind w:left="510" w:hanging="510"/>
-      </w:pPr>
-      <w:r>
-        <w:rPr>
-          <w:b/>
-          <w:i w:val="0"/>
-        </w:rPr>
-        <w:t>140.</w:t>
-      </w:r>
-      <w:r>
-        <w:t xml:space="preserve"> Два певца Враджа, Мадхуканта и Мадхуврата, — это певцы Гауранги Мукунда и Васудева Датта.</w:t>
-      </w:r>
-    </w:p>
-    <w:p>
-      <w:pPr>
-        <w:spacing w:after="60"/>
-        <w:ind w:left="510" w:hanging="510"/>
-      </w:pPr>
-      <w:r>
-        <w:rPr>
-          <w:b/>
-          <w:i w:val="0"/>
-        </w:rPr>
-        <w:t>141.</w:t>
-      </w:r>
-      <w:r>
-        <w:t xml:space="preserve"> Прежний актёр Чандрамукха — это Макарадхваджа Кара.</w:t>
-      </w:r>
-    </w:p>
-    <w:p>
-      <w:pPr>
-        <w:spacing w:after="60"/>
-        <w:ind w:left="510" w:hanging="510"/>
-      </w:pPr>
-      <w:r>
-        <w:rPr>
-          <w:b/>
-          <w:i w:val="0"/>
-        </w:rPr>
-        <w:t>142.</w:t>
-      </w:r>
-      <w:r>
-        <w:t xml:space="preserve"> Тот, кто прежде во Врадже был барабанщиком на мриданге по имени Шри Судхакара, ныне — Шри Шанкха Гхош, искусный в игре на дамфе.</w:t>
-      </w:r>
-    </w:p>
-    <w:p>
-      <w:pPr>
-        <w:spacing w:after="60"/>
-        <w:ind w:left="510" w:hanging="510"/>
-      </w:pPr>
-      <w:r>
-        <w:rPr>
-          <w:b/>
-          <w:i w:val="0"/>
-        </w:rPr>
-        <w:t>143.</w:t>
-      </w:r>
-      <w:r>
-        <w:t xml:space="preserve"> Чандрахаса, танцор Враджа, знаток расы, — это любитель танца Шри Джагадиша Пандит.</w:t>
-      </w:r>
-    </w:p>
-    <w:p>
-      <w:pPr>
-        <w:spacing w:after="60"/>
-        <w:ind w:left="510" w:hanging="510"/>
-      </w:pPr>
-      <w:r>
-        <w:rPr>
-          <w:b/>
-          <w:i w:val="0"/>
-        </w:rPr>
-        <w:t>144.</w:t>
-      </w:r>
-      <w:r>
-        <w:t xml:space="preserve"> Тот, кто во Врадже по имени Маладхара держал флейту-вену и мурали, ныне — Пандит по имени Ванамали, любимец Гауры.</w:t>
-      </w:r>
-    </w:p>
-    <w:p>
-      <w:pPr>
-        <w:spacing w:after="60"/>
-        <w:ind w:left="510" w:hanging="510"/>
-      </w:pPr>
-      <w:r>
-        <w:rPr>
-          <w:b/>
-          <w:i w:val="0"/>
-        </w:rPr>
-        <w:t>145.</w:t>
-      </w:r>
-      <w:r>
-        <w:t xml:space="preserve"> Два прославленных попугая Вриндаваны, Дакша и Вичакшана, ныне родились моими старшими братьями — Чайтаньей и Рамадасом</w:t>
-      </w:r>
-      <w:r>
-        <w:rPr>
-          <w:b w:val="0"/>
-          <w:i w:val="0"/>
-          <w:vertAlign w:val="superscript"/>
-        </w:rPr>
-        <w:t>43</w:t>
-      </w:r>
-      <w:r>
-        <w:t>.</w:t>
-      </w:r>
-    </w:p>
-    <w:p>
-      <w:pPr>
-        <w:pStyle w:val="Heading2"/>
-      </w:pPr>
-      <w:r>
-        <w:t>Гопи — «сила преданного»</w:t>
-      </w:r>
-    </w:p>
-    <w:p>
-      <w:pPr>
-        <w:spacing w:after="60"/>
-        <w:ind w:left="510" w:hanging="510"/>
-      </w:pPr>
-      <w:r>
-        <w:rPr>
-          <w:b/>
-          <w:i w:val="0"/>
-        </w:rPr>
-        <w:t>146.</w:t>
-      </w:r>
-      <w:r>
-        <w:t xml:space="preserve"> Теперь, сообразно разумению и услышанному, называются те из пастушек, кто стал любимцами Прабху.</w:t>
-      </w:r>
-    </w:p>
-    <w:p>
-      <w:pPr>
-        <w:spacing w:after="60"/>
-        <w:ind w:left="510" w:hanging="510"/>
-      </w:pPr>
-      <w:r>
-        <w:rPr>
-          <w:b/>
-          <w:i w:val="0"/>
-        </w:rPr>
-        <w:t>147.</w:t>
-      </w:r>
-      <w:r>
-        <w:t xml:space="preserve"> Та, что некогда была Владычицей Вриндаваны, воплощение любви Шри Радхи, — это Шри Гададхара, любимец Гауры, называемый Пандитом.</w:t>
-      </w:r>
-    </w:p>
-    <w:p>
-      <w:pPr>
-        <w:spacing w:after="60"/>
-        <w:ind w:left="510" w:hanging="510"/>
-      </w:pPr>
-      <w:r>
-        <w:rPr>
-          <w:b/>
-          <w:i w:val="0"/>
-        </w:rPr>
-        <w:t>148.</w:t>
-      </w:r>
-      <w:r>
-        <w:t xml:space="preserve"> Как определили стопы Сварупы, он — Лакшми Враджа:</w:t>
-      </w:r>
-    </w:p>
-    <w:p>
-      <w:pPr>
-        <w:spacing w:after="60"/>
-        <w:ind w:left="510" w:hanging="510"/>
-      </w:pPr>
-      <w:r>
-        <w:rPr>
-          <w:b/>
-          <w:i w:val="0"/>
-        </w:rPr>
-        <w:t>149.</w:t>
-      </w:r>
-      <w:r>
-        <w:t xml:space="preserve"> «Лакшми, некогда возлюбленная Шьямасундары во Вриндаване, ныне — Лакшми любви Гауры, Шри Гададхара Пандит».</w:t>
-      </w:r>
-    </w:p>
-    <w:p>
-      <w:pPr>
-        <w:spacing w:after="60"/>
-        <w:ind w:left="510" w:hanging="510"/>
-      </w:pPr>
-      <w:r>
-        <w:rPr>
-          <w:b/>
-          <w:i w:val="0"/>
-        </w:rPr>
-        <w:t>150.</w:t>
-      </w:r>
-      <w:r>
-        <w:t xml:space="preserve"> Поскольку Лалита — спутница Радхи, «Анурадхика», она тоже вошла в него, как сказано в «Гаура-чандродае»:</w:t>
-      </w:r>
-    </w:p>
-    <w:p>
-      <w:pPr>
-        <w:spacing w:after="60"/>
-        <w:ind w:left="510" w:hanging="510"/>
-      </w:pPr>
-      <w:r>
-        <w:rPr>
-          <w:b/>
-          <w:i w:val="0"/>
-        </w:rPr>
-        <w:t>151.</w:t>
-      </w:r>
-      <w:r>
-        <w:t xml:space="preserve"> «Это тоже Лалита, подруга Радхики, а вовсе не этот владыка брахманов Гададхара; или же этот Хари своей собственной силой стал троицей — и подругой, и Радхикой».</w:t>
-      </w:r>
-    </w:p>
-    <w:p>
-      <w:pPr>
-        <w:spacing w:after="60"/>
-        <w:ind w:left="510" w:hanging="510"/>
-      </w:pPr>
-      <w:r>
-        <w:rPr>
-          <w:b/>
-          <w:i w:val="0"/>
-        </w:rPr>
-        <w:t>152.</w:t>
-      </w:r>
-      <w:r>
-        <w:t xml:space="preserve"> Другие говорили, что Лалита — это Дхрувананда Брахмачари; по различию своих проявлений верно и это мнение.</w:t>
-      </w:r>
-    </w:p>
-    <w:p>
-      <w:pPr>
-        <w:spacing w:after="60"/>
-        <w:ind w:left="510" w:hanging="510"/>
-      </w:pPr>
-      <w:r>
-        <w:rPr>
-          <w:b/>
-          <w:i w:val="0"/>
-        </w:rPr>
-        <w:t>153.</w:t>
-      </w:r>
-      <w:r>
-        <w:t xml:space="preserve"> Или же Бхагаван Гаура по собственной воле принял троякий облик; поэтому Шри Гададхара Пандит — это облик Шри Радхики.</w:t>
-      </w:r>
-    </w:p>
-    <w:p>
-      <w:pPr>
-        <w:spacing w:after="60"/>
-        <w:ind w:left="510" w:hanging="510"/>
-      </w:pPr>
-      <w:r>
-        <w:rPr>
-          <w:b/>
-          <w:i w:val="0"/>
-        </w:rPr>
-        <w:t>154.</w:t>
-      </w:r>
-      <w:r>
-        <w:t xml:space="preserve"> Чандраканти, бывшая проявлением славы Радхи, ныне рядом с Гаурангой — Гададхара из рода Дасов</w:t>
-      </w:r>
-      <w:r>
-        <w:rPr>
-          <w:b w:val="0"/>
-          <w:i w:val="0"/>
-          <w:vertAlign w:val="superscript"/>
-        </w:rPr>
-        <w:t>44</w:t>
-      </w:r>
-      <w:r>
-        <w:t>.</w:t>
-      </w:r>
-    </w:p>
-    <w:p>
-      <w:pPr>
-        <w:spacing w:after="60"/>
-        <w:ind w:left="510" w:hanging="510"/>
-      </w:pPr>
-      <w:r>
-        <w:rPr>
-          <w:b/>
-          <w:i w:val="0"/>
-        </w:rPr>
-        <w:t>155.</w:t>
-      </w:r>
-      <w:r>
-        <w:t xml:space="preserve"> Пурнананда, первая среди возлюбленных Баладевы во Врадже, тоже ради дела вошла в этого Гададхару.</w:t>
-      </w:r>
-    </w:p>
-    <w:p>
-      <w:pPr>
-        <w:spacing w:after="60"/>
-        <w:ind w:left="510" w:hanging="510"/>
-      </w:pPr>
-      <w:r>
-        <w:rPr>
-          <w:b/>
-          <w:i w:val="0"/>
-        </w:rPr>
-        <w:t>156.</w:t>
-      </w:r>
-      <w:r>
-        <w:t xml:space="preserve"> Чандравали, некогда высшая возлюбленная Кришны во Врадже, ныне в Гауде — это Кавираджа Садашива.</w:t>
-      </w:r>
-    </w:p>
-    <w:p>
-      <w:pPr>
-        <w:spacing w:after="60"/>
-        <w:ind w:left="510" w:hanging="510"/>
-      </w:pPr>
-      <w:r>
-        <w:rPr>
-          <w:b/>
-          <w:i w:val="0"/>
-        </w:rPr>
-        <w:t>157.</w:t>
-      </w:r>
-      <w:r>
-        <w:t xml:space="preserve"> Шри Бхадра, на груди которой некогда спал Кришна во Вриндаване, ныне — любимец Гауранги Шанкха Пандит.</w:t>
-      </w:r>
-    </w:p>
-    <w:p>
-      <w:pPr>
-        <w:spacing w:after="60"/>
-        <w:ind w:left="510" w:hanging="510"/>
-      </w:pPr>
-      <w:r>
-        <w:rPr>
-          <w:b/>
-          <w:i w:val="0"/>
-        </w:rPr>
-        <w:t>158.</w:t>
-      </w:r>
-      <w:r>
-        <w:t xml:space="preserve"> Тарака и Пали, некогда пребывавшие во Враджа-мандале, ныне — любимцы Прабху Джаганнатха и Шри Гопала.</w:t>
-      </w:r>
-    </w:p>
-    <w:p>
-      <w:pPr>
-        <w:spacing w:after="60"/>
-        <w:ind w:left="510" w:hanging="510"/>
-      </w:pPr>
-      <w:r>
-        <w:rPr>
-          <w:b/>
-          <w:i w:val="0"/>
-        </w:rPr>
-        <w:t>159.</w:t>
-      </w:r>
-      <w:r>
-        <w:t xml:space="preserve"> Шайбья, бывшая во Врадже Чанди</w:t>
-      </w:r>
-      <w:r>
-        <w:rPr>
-          <w:b w:val="0"/>
-          <w:i w:val="0"/>
-          <w:vertAlign w:val="superscript"/>
-        </w:rPr>
-        <w:t>45</w:t>
-      </w:r>
-      <w:r>
-        <w:t>, — это Дамодара Пандит; по некоей причине в него вошла и богиня Сарасвати.</w:t>
-      </w:r>
-    </w:p>
-    <w:p>
-      <w:pPr>
-        <w:spacing w:after="60"/>
-        <w:ind w:left="510" w:hanging="510"/>
-      </w:pPr>
-      <w:r>
-        <w:rPr>
-          <w:b/>
-          <w:i w:val="0"/>
-        </w:rPr>
-        <w:t>160.</w:t>
-      </w:r>
-      <w:r>
-        <w:t xml:space="preserve"> Вишакха, что некогда во Врадже учила Радху искусствам, ныне — Сварупа Госвами, наслаждающийся теми же чувствами.</w:t>
-      </w:r>
-    </w:p>
-    <w:p>
-      <w:pPr>
-        <w:spacing w:after="60"/>
-        <w:ind w:left="510" w:hanging="510"/>
-      </w:pPr>
-      <w:r>
-        <w:rPr>
-          <w:b/>
-          <w:i w:val="0"/>
-        </w:rPr>
-        <w:t>161.</w:t>
-      </w:r>
-      <w:r>
-        <w:t xml:space="preserve"> Читра, которая некогда во Врадже укладывала волосы Радхе, ныне — Кавираджа Шри Ванамали, любимец Прабху.</w:t>
-      </w:r>
-    </w:p>
-    <w:p>
-      <w:pPr>
-        <w:spacing w:after="60"/>
-        <w:ind w:left="510" w:hanging="510"/>
-      </w:pPr>
-      <w:r>
-        <w:rPr>
-          <w:b/>
-          <w:i w:val="0"/>
-        </w:rPr>
-        <w:t>162.</w:t>
-      </w:r>
-      <w:r>
-        <w:t xml:space="preserve"> Шри Чампакалата, бывшая жизнью Шри Радхи во Врадже, ныне — Рагхава Госвами, поселившийся у Говардханы, составивший книгу «Бхакти-ратна-пракаша».</w:t>
-      </w:r>
-    </w:p>
-    <w:p>
-      <w:pPr>
-        <w:spacing w:after="60"/>
-        <w:ind w:left="510" w:hanging="510"/>
-      </w:pPr>
-      <w:r>
-        <w:rPr>
-          <w:b/>
-          <w:i w:val="0"/>
-        </w:rPr>
-        <w:t>163.</w:t>
-      </w:r>
-      <w:r>
-        <w:t xml:space="preserve"> Тунгавидья, бывшая во Врадже знатоком всех шастр, — это отшельник Прабодхананда, Сарасвати, воспевающий Гауру.</w:t>
-      </w:r>
-    </w:p>
-    <w:p>
-      <w:pPr>
-        <w:spacing w:after="60"/>
-        <w:ind w:left="510" w:hanging="510"/>
-      </w:pPr>
-      <w:r>
-        <w:rPr>
-          <w:b/>
-          <w:i w:val="0"/>
-        </w:rPr>
-        <w:t>164.</w:t>
-      </w:r>
-      <w:r>
-        <w:t xml:space="preserve"> Индулекха, бывшая некогда во Врадже подругой Шри Радхи, — это Кришнадас Брахмачари, поселившийся во Вриндаване.</w:t>
-      </w:r>
-    </w:p>
-    <w:p>
-      <w:pPr>
-        <w:spacing w:after="60"/>
-        <w:ind w:left="510" w:hanging="510"/>
-      </w:pPr>
-      <w:r>
-        <w:rPr>
-          <w:b/>
-          <w:i w:val="0"/>
-        </w:rPr>
-        <w:t>165.</w:t>
-      </w:r>
-      <w:r>
-        <w:t xml:space="preserve"> Рангадеви — ныне Гададхара Бхатта; Анантачарья Госвами — та, что была Судеви во Врадже</w:t>
-      </w:r>
-      <w:r>
-        <w:rPr>
-          <w:b w:val="0"/>
-          <w:i w:val="0"/>
-          <w:vertAlign w:val="superscript"/>
-        </w:rPr>
-        <w:t>46</w:t>
-      </w:r>
-      <w:r>
-        <w:t>.</w:t>
-      </w:r>
-    </w:p>
-    <w:p>
-      <w:pPr>
-        <w:spacing w:after="60"/>
-        <w:ind w:left="510" w:hanging="510"/>
-      </w:pPr>
-      <w:r>
-        <w:rPr>
-          <w:b/>
-          <w:i w:val="0"/>
-        </w:rPr>
-        <w:t>166.</w:t>
-      </w:r>
-      <w:r>
-        <w:t xml:space="preserve"> Шри Кашишвара Госвами — прежняя Шаширекха во Врадже. Дхаништха, приносившая Кришне во Врадже безмерно много угощений, — это ныне любимец Гауранги Рагхава Пандит.</w:t>
-      </w:r>
-    </w:p>
-    <w:p>
-      <w:pPr>
-        <w:spacing w:after="60"/>
-        <w:ind w:left="510" w:hanging="510"/>
-      </w:pPr>
-      <w:r>
-        <w:rPr>
-          <w:b/>
-          <w:i w:val="0"/>
-        </w:rPr>
-        <w:t>167.</w:t>
-      </w:r>
-      <w:r>
-        <w:t xml:space="preserve"> Гунамала во Врадже — это [Рагхава?], а её сестра Дамаянти — [его сестра]</w:t>
-      </w:r>
-      <w:r>
-        <w:rPr>
-          <w:b w:val="0"/>
-          <w:i w:val="0"/>
-          <w:vertAlign w:val="superscript"/>
-        </w:rPr>
-        <w:t>47</w:t>
-      </w:r>
-      <w:r>
-        <w:t>; Ратнарекха — Кришнадас, Калавати — Кришнананда.</w:t>
-      </w:r>
-    </w:p>
-    <w:p>
-      <w:pPr>
-        <w:spacing w:after="60"/>
-        <w:ind w:left="510" w:hanging="510"/>
-      </w:pPr>
-      <w:r>
-        <w:rPr>
-          <w:b/>
-          <w:i w:val="0"/>
-        </w:rPr>
-        <w:t>168.</w:t>
-      </w:r>
-      <w:r>
-        <w:t xml:space="preserve"> Шаурасени — это искусный Нараяна Вачаспати; Кавери — Питамбара; Сукеши — Макарадхваджа.</w:t>
-      </w:r>
-    </w:p>
-    <w:p>
-      <w:pPr>
-        <w:spacing w:after="60"/>
-        <w:ind w:left="510" w:hanging="510"/>
-      </w:pPr>
-      <w:r>
-        <w:rPr>
-          <w:b/>
-          <w:i w:val="0"/>
-        </w:rPr>
-        <w:t>169.</w:t>
-      </w:r>
-      <w:r>
-        <w:t xml:space="preserve"> Мадхави — Мадхавачарья, Индира — Джива Пандит.</w:t>
-      </w:r>
-    </w:p>
-    <w:p>
-      <w:pPr>
-        <w:spacing w:after="60"/>
-        <w:ind w:left="510" w:hanging="510"/>
-      </w:pPr>
-      <w:r>
-        <w:rPr>
-          <w:b/>
-          <w:i w:val="0"/>
-        </w:rPr>
-        <w:t>170.</w:t>
-      </w:r>
-      <w:r>
-        <w:t xml:space="preserve"> Сумадхура, бывшая во Врадже любимицей Тунгавидьи, — это Видья Вачаспати, любимец Гауры и любимец жителей Враджа.</w:t>
-      </w:r>
-    </w:p>
-    <w:p>
-      <w:pPr>
-        <w:spacing w:after="60"/>
-        <w:ind w:left="510" w:hanging="510"/>
-      </w:pPr>
-      <w:r>
-        <w:rPr>
-          <w:b/>
-          <w:i w:val="0"/>
-        </w:rPr>
-        <w:t>171.</w:t>
-      </w:r>
-      <w:r>
-        <w:t xml:space="preserve"> Балабхадра Бхаттачарья — Шри Мадхурекшана; Шринатха Мишра — Читранги; Кавичандра — Манохара.</w:t>
-      </w:r>
-    </w:p>
-    <w:p>
-      <w:pPr>
-        <w:spacing w:after="60"/>
-        <w:ind w:left="510" w:hanging="510"/>
-      </w:pPr>
-      <w:r>
-        <w:rPr>
-          <w:b/>
-          <w:i w:val="0"/>
-        </w:rPr>
-        <w:t>172.</w:t>
-      </w:r>
-      <w:r>
-        <w:t xml:space="preserve"> Нандимукхи, бывшая во Врадже, ныне — Саранга Тхакур. Некоторые считают его Прахладой, но мой отец этого не признаёт.</w:t>
-      </w:r>
-    </w:p>
-    <w:p>
-      <w:pPr>
-        <w:spacing w:after="60"/>
-        <w:ind w:left="510" w:hanging="510"/>
-      </w:pPr>
-      <w:r>
-        <w:rPr>
-          <w:b/>
-          <w:i w:val="0"/>
-        </w:rPr>
-        <w:t>173.</w:t>
-      </w:r>
-      <w:r>
-        <w:t xml:space="preserve"> Калаканти и Суканти, бывшие во Врадже в гандхарвской труппе, — это, соответственно, Рамананда Васу и Сатьяраджа.</w:t>
-      </w:r>
-    </w:p>
-    <w:p>
-      <w:pPr>
-        <w:spacing w:after="60"/>
-        <w:ind w:left="510" w:hanging="510"/>
-      </w:pPr>
-      <w:r>
-        <w:rPr>
-          <w:b/>
-          <w:i w:val="0"/>
-        </w:rPr>
-        <w:t>174.</w:t>
-      </w:r>
-      <w:r>
-        <w:t xml:space="preserve"> Та, что во Врадже была Катьяяни, ныне — Шри Канта Сена.</w:t>
-      </w:r>
-    </w:p>
-    <w:p>
-      <w:pPr>
-        <w:spacing w:after="60"/>
-        <w:ind w:left="510" w:hanging="510"/>
-      </w:pPr>
-      <w:r>
-        <w:rPr>
-          <w:b/>
-          <w:i w:val="0"/>
-        </w:rPr>
-        <w:t>175.</w:t>
-      </w:r>
-      <w:r>
-        <w:t xml:space="preserve"> Распорядительница Враджа по имени Вринда-деви — это ныне Шри Мукунда Дас из Кханды, любимец Прабху.</w:t>
-      </w:r>
-    </w:p>
-    <w:p>
-      <w:pPr>
-        <w:spacing w:after="60"/>
-        <w:ind w:left="510" w:hanging="510"/>
-      </w:pPr>
-      <w:r>
-        <w:rPr>
-          <w:b/>
-          <w:i w:val="0"/>
-        </w:rPr>
-        <w:t>176.</w:t>
-      </w:r>
-      <w:r>
-        <w:t xml:space="preserve"> Посланница Вира, что некогда во Вриндаване приводила всех гопи к Кришне, — это ныне мой отец; та, что во Врадже была Биндумати, — это ныне моя мать.</w:t>
-      </w:r>
-    </w:p>
-    <w:p>
-      <w:pPr>
-        <w:spacing w:after="60"/>
-        <w:ind w:left="510" w:hanging="510"/>
-      </w:pPr>
-      <w:r>
-        <w:rPr>
-          <w:b/>
-          <w:i w:val="0"/>
-        </w:rPr>
-        <w:t>177.</w:t>
-      </w:r>
-      <w:r>
-        <w:t xml:space="preserve"> Мадхумати, некогда задушевная подруга во Вриндаване, ныне — Нарахари Саркар, любимец Прабху.</w:t>
-      </w:r>
-    </w:p>
-    <w:p>
-      <w:pPr>
-        <w:spacing w:after="60"/>
-        <w:ind w:left="510" w:hanging="510"/>
-      </w:pPr>
-      <w:r>
-        <w:rPr>
-          <w:b/>
-          <w:i w:val="0"/>
-        </w:rPr>
-        <w:t>178.</w:t>
-      </w:r>
-      <w:r>
-        <w:t xml:space="preserve"> Задушевная подруга во Врадже по имени Ратнавали — это Гопинатха Ачарья, прославленный чистотой.</w:t>
-      </w:r>
-    </w:p>
-    <w:p>
-      <w:pPr>
-        <w:spacing w:after="60"/>
-        <w:ind w:left="510" w:hanging="510"/>
-      </w:pPr>
-      <w:r>
-        <w:rPr>
-          <w:b/>
-          <w:i w:val="0"/>
-        </w:rPr>
-        <w:t>179.</w:t>
-      </w:r>
-      <w:r>
-        <w:t xml:space="preserve"> Флейта, любимица Кришны, — это Вамши Дас Тхакур</w:t>
-      </w:r>
-      <w:r>
-        <w:rPr>
-          <w:b w:val="0"/>
-          <w:i w:val="0"/>
-          <w:vertAlign w:val="superscript"/>
-        </w:rPr>
-        <w:t>48</w:t>
-      </w:r>
-      <w:r>
-        <w:t>.</w:t>
-      </w:r>
-    </w:p>
-    <w:p>
-      <w:pPr>
-        <w:pStyle w:val="Heading2"/>
-      </w:pPr>
-      <w:r>
-        <w:t>Манджари</w:t>
-      </w:r>
-    </w:p>
-    <w:p>
-      <w:pPr>
-        <w:spacing w:after="60"/>
-        <w:ind w:left="510" w:hanging="510"/>
-      </w:pPr>
-      <w:r>
-        <w:rPr>
-          <w:b/>
-          <w:i w:val="0"/>
-        </w:rPr>
-        <w:t>180.</w:t>
-      </w:r>
-      <w:r>
-        <w:t xml:space="preserve"> Шри Рупа-манджари, прославленная некогда во Вриндаване, ныне явилась, став Рупой Госвами.</w:t>
-      </w:r>
-    </w:p>
-    <w:p>
-      <w:pPr>
-        <w:spacing w:after="60"/>
-        <w:ind w:left="510" w:hanging="510"/>
-      </w:pPr>
-      <w:r>
-        <w:rPr>
-          <w:b/>
-          <w:i w:val="0"/>
-        </w:rPr>
-        <w:t>181.</w:t>
-      </w:r>
-      <w:r>
-        <w:t xml:space="preserve"> Рати-манджари, любимейшая подруга Рупа-манджари, мудрыми называется также по-иному — Лаванга-манджари.</w:t>
-      </w:r>
-    </w:p>
-    <w:p>
-      <w:pPr>
-        <w:spacing w:after="60"/>
-        <w:ind w:left="510" w:hanging="510"/>
-      </w:pPr>
-      <w:r>
-        <w:rPr>
-          <w:b/>
-          <w:i w:val="0"/>
-        </w:rPr>
-        <w:t>182.</w:t>
-      </w:r>
-      <w:r>
-        <w:t xml:space="preserve"> Она ныне — Санатана, неотличный по телу от Гауры, достойный почитания всеми; ради дела в него вошёл и Санатана, драгоценность среди мудрецов</w:t>
-      </w:r>
-      <w:r>
-        <w:rPr>
-          <w:b w:val="0"/>
-          <w:i w:val="0"/>
-          <w:vertAlign w:val="superscript"/>
-        </w:rPr>
-        <w:t>49</w:t>
-      </w:r>
-      <w:r>
-        <w:t>.</w:t>
-      </w:r>
-    </w:p>
-    <w:p>
-      <w:pPr>
-        <w:spacing w:after="60"/>
-        <w:ind w:left="510" w:hanging="510"/>
-      </w:pPr>
-      <w:r>
-        <w:rPr>
-          <w:b/>
-          <w:i w:val="0"/>
-        </w:rPr>
-        <w:t>183.</w:t>
-      </w:r>
-      <w:r>
-        <w:t xml:space="preserve"> Как проявление Шримати Лаванга-манджари прославлен Шивананда Чакраварти, поселившийся во Вриндаване.</w:t>
-      </w:r>
-    </w:p>
-    <w:p>
-      <w:pPr>
-        <w:spacing w:after="60"/>
-        <w:ind w:left="510" w:hanging="510"/>
-      </w:pPr>
-      <w:r>
-        <w:rPr>
-          <w:b/>
-          <w:i w:val="0"/>
-        </w:rPr>
-        <w:t>184.</w:t>
-      </w:r>
-      <w:r>
-        <w:t xml:space="preserve"> Ананга-манджари — ныне Гопала Бхатта; иные же называют Бхатту Госвами Шри Гуна-манджари.</w:t>
-      </w:r>
-    </w:p>
-    <w:p>
-      <w:pPr>
-        <w:spacing w:after="60"/>
-        <w:ind w:left="510" w:hanging="510"/>
-      </w:pPr>
-      <w:r>
-        <w:rPr>
-          <w:b/>
-          <w:i w:val="0"/>
-        </w:rPr>
-        <w:t>185.</w:t>
-      </w:r>
-      <w:r>
-        <w:t xml:space="preserve"> Рагхунатха Бхатта — это прежняя Рага-манджари; он поселился в хижине у Шри Радха-кунды.</w:t>
-      </w:r>
-    </w:p>
-    <w:p>
-      <w:pPr>
-        <w:spacing w:after="60"/>
-        <w:ind w:left="510" w:hanging="510"/>
-      </w:pPr>
-      <w:r>
-        <w:rPr>
-          <w:b/>
-          <w:i w:val="0"/>
-        </w:rPr>
-        <w:t>186.</w:t>
-      </w:r>
-      <w:r>
-        <w:t xml:space="preserve"> Прежнее имя Рагхунатхи Даса — Раса-манджари; некоторые называют его Шримати Рати-манджари, а иные по различию имён — Бханумати.</w:t>
-      </w:r>
-    </w:p>
-    <w:p>
-      <w:pPr>
-        <w:spacing w:after="60"/>
-        <w:ind w:left="510" w:hanging="510"/>
-      </w:pPr>
-      <w:r>
-        <w:rPr>
-          <w:b/>
-          <w:i w:val="0"/>
-        </w:rPr>
-        <w:t>187.</w:t>
-      </w:r>
-      <w:r>
-        <w:t xml:space="preserve"> Прежнее имя Бхугарбхи Тхакура — Према-манджари; Локанатха Госвами — прежняя Шри Лила-манджари.</w:t>
-      </w:r>
-    </w:p>
-    <w:p>
-      <w:pPr>
-        <w:spacing w:after="60"/>
-        <w:ind w:left="510" w:hanging="510"/>
-      </w:pPr>
-      <w:r>
-        <w:rPr>
-          <w:b/>
-          <w:i w:val="0"/>
-        </w:rPr>
-        <w:t>188.</w:t>
-      </w:r>
-      <w:r>
-        <w:t xml:space="preserve"> Калавати, Расолласа и Гунатунга, бывшие во Врадже и певшие песни, сложенные Шри Вишакхой, считаются ныне, соответственно, Говиндой, Мадхавой и Васудевой</w:t>
-      </w:r>
-      <w:r>
-        <w:rPr>
-          <w:b w:val="0"/>
-          <w:i w:val="0"/>
-          <w:vertAlign w:val="superscript"/>
-        </w:rPr>
-        <w:t>50</w:t>
-      </w:r>
-      <w:r>
-        <w:t>.</w:t>
-      </w:r>
-    </w:p>
-    <w:p>
-      <w:pPr>
-        <w:spacing w:after="60"/>
-        <w:ind w:left="510" w:hanging="510"/>
-      </w:pPr>
-      <w:r>
-        <w:rPr>
-          <w:b/>
-          <w:i w:val="0"/>
-        </w:rPr>
-        <w:t>189.</w:t>
-      </w:r>
-      <w:r>
-        <w:t xml:space="preserve"> Рагалекха и Калакели, служанки Радхи, — это, соответственно, Шикхи Махити и её сестра Мадхави.</w:t>
-      </w:r>
-    </w:p>
-    <w:p>
-      <w:pPr>
-        <w:spacing w:after="60"/>
-        <w:ind w:left="510" w:hanging="510"/>
-      </w:pPr>
-      <w:r>
-        <w:rPr>
-          <w:b/>
-          <w:i w:val="0"/>
-        </w:rPr>
-        <w:t>190.</w:t>
-      </w:r>
-      <w:r>
-        <w:t xml:space="preserve"> [—] дочь пулинды Малли — ныне Калидас</w:t>
-      </w:r>
-      <w:r>
-        <w:rPr>
-          <w:b w:val="0"/>
-          <w:i w:val="0"/>
-          <w:vertAlign w:val="superscript"/>
-        </w:rPr>
-        <w:t>51</w:t>
-      </w:r>
-      <w:r>
-        <w:t>.</w:t>
-      </w:r>
-    </w:p>
-    <w:p>
-      <w:pPr>
-        <w:spacing w:after="60"/>
-        <w:ind w:left="510" w:hanging="510"/>
-      </w:pPr>
-      <w:r>
-        <w:rPr>
-          <w:b/>
-          <w:i w:val="0"/>
-        </w:rPr>
-        <w:t>191.</w:t>
-      </w:r>
-      <w:r>
-        <w:t xml:space="preserve"> Шукламбара Брахмачари прежде была женой жреца — поэтому Прабху Гауранга, попросив, ел его пищу. Некоторые говорят, что Брахмачари прежде был брахманом-жрецом.</w:t>
-      </w:r>
-    </w:p>
-    <w:p>
-      <w:pPr>
-        <w:spacing w:after="60"/>
-        <w:ind w:left="510" w:hanging="510"/>
-      </w:pPr>
-      <w:r>
-        <w:rPr>
-          <w:b/>
-          <w:i w:val="0"/>
-        </w:rPr>
-        <w:t>192.</w:t>
-      </w:r>
-      <w:r>
-        <w:t xml:space="preserve"> Другие жёны жрецов — Шри Джагадиша и Хираньяка, у которых Прабху в экадаши, попросив, ел пищу.</w:t>
-      </w:r>
-    </w:p>
-    <w:p>
-      <w:pPr>
-        <w:spacing w:after="60"/>
-        <w:ind w:left="510" w:hanging="510"/>
-      </w:pPr>
-      <w:r>
-        <w:rPr>
-          <w:b/>
-          <w:i w:val="0"/>
-        </w:rPr>
-        <w:t>193.</w:t>
-      </w:r>
-      <w:r>
-        <w:t xml:space="preserve"> Сайрандхри, некогда возлюбленная Кришны в Матхуре, ныне — живущий в Нилачале Каши Мишра, любимец Прабху.</w:t>
-      </w:r>
-    </w:p>
-    <w:p>
-      <w:pPr>
-        <w:spacing w:after="60"/>
-        <w:jc w:val="both"/>
-      </w:pPr>
-      <w:r>
-        <w:rPr>
-          <w:b/>
-          <w:i w:val="0"/>
-        </w:rPr>
-        <w:t>194–207.</w:t>
-      </w:r>
-      <w:r>
-        <w:t xml:space="preserve"> Малати, Чандралатика, Манджумедха, Варангада, Ратнавали, Камала, Гуначуда, Сукешини, Карпура-манджари, Шьяма-манджари, Швета-манджари, Виласа-манджари, Камалекха, Мауна-манджари, Гандхонмада, Расонмада, Чандрика, Калабхашини, Гопали, Харини, Кали, Калакши, Нитья-манджари, Калаканти, Курангакши, Чандрика и Чандрашекхара — все те, кого Радха поставила на подобающее каждой служение, — приняв мужские тела, по своей природе играли вместе с Гаурой и его любимцами, по порядку так: брахман Шубхананда; Шридхара Брахмачари; Парамананда Гупта, составивший «Кришна-стававали»; некий брахман Рагхунатха, служащий одному Гауранге; Камсари Сена; почтенный Шри Джаганнатха Сена; Субуддхи Мишра; Шри Харша; Рагху Мишра, лучший из брахманов; Джитамитра — достойный своего имени, ибо им побеждены и подчинены шесть врагов во главе с вожделением, — так назвал его Гаура; составивший книжку «Кришна-према-тарангини» Шримад-Бхагаватачарья, крайне любимый Гаурангой; благонравный учёный Шриман Джива, сын Шри Валлабхи; брахман Ванинатха из Чампахатты, любимец Прабху; Ишана Ачарья и Камала; Пандит по имени Лакшминатха; Гангамантри; Джаганнатха по прозванию Маму, лучший из брахманов; Ананта из рода Чаттов по прозванию Кантхабхарана; Хасти-Гопала; Валлабха из Ранги; Хари Ачарья, спутник Гауры; Шри Наяна Мишра; Кавидатта; Рамадас; Чиранджива и Сулочана</w:t>
-      </w:r>
-      <w:r>
-        <w:rPr>
-          <w:b w:val="0"/>
-          <w:i w:val="0"/>
-          <w:vertAlign w:val="superscript"/>
-        </w:rPr>
-        <w:t>52</w:t>
-      </w:r>
-      <w:r>
-        <w:t>.</w:t>
-      </w:r>
-    </w:p>
-    <w:p>
-      <w:pPr>
-        <w:pStyle w:val="Heading2"/>
-      </w:pPr>
-      <w:r>
-        <w:t>Заключение</w:t>
-      </w:r>
-    </w:p>
-    <w:p>
-      <w:pPr>
-        <w:spacing w:after="60"/>
-        <w:ind w:left="510" w:hanging="510"/>
-      </w:pPr>
-      <w:r>
-        <w:rPr>
-          <w:b/>
-          <w:i w:val="0"/>
-        </w:rPr>
-        <w:t>208.</w:t>
-      </w:r>
-      <w:r>
-        <w:t xml:space="preserve"> Одни из них — маханты, другие — упа-маханты; достоинства тех и других равны, поэтому я перечислил их вместе.</w:t>
-      </w:r>
-    </w:p>
-    <w:p>
-      <w:pPr>
-        <w:spacing w:after="60"/>
-        <w:ind w:left="510" w:hanging="510"/>
-      </w:pPr>
-      <w:r>
-        <w:rPr>
-          <w:b/>
-          <w:i w:val="0"/>
-        </w:rPr>
-        <w:t>209.</w:t>
-      </w:r>
-      <w:r>
-        <w:t xml:space="preserve"> Чиранджива и Сулочана, живущие в Кханде, благодаря общению с Нарахари стоят выше; их единственное прибежище — Гауранга.</w:t>
-      </w:r>
-    </w:p>
-    <w:p>
-      <w:pPr>
-        <w:spacing w:after="60"/>
-        <w:ind w:left="510" w:hanging="510"/>
-      </w:pPr>
-      <w:r>
-        <w:rPr>
-          <w:b/>
-          <w:i w:val="0"/>
-        </w:rPr>
-        <w:t>210.</w:t>
-      </w:r>
-      <w:r>
-        <w:t xml:space="preserve"> Согласно шастре, что гласит: «не следует произносить имени гуру», я не открыл прежнего имени Шри Шринатхи.</w:t>
-      </w:r>
-    </w:p>
-    <w:p>
-      <w:pPr>
-        <w:spacing w:after="60"/>
-        <w:ind w:left="510" w:hanging="510"/>
-      </w:pPr>
-      <w:r>
-        <w:rPr>
-          <w:b/>
-          <w:i w:val="0"/>
-        </w:rPr>
-        <w:t>211.</w:t>
-      </w:r>
-      <w:r>
-        <w:t xml:space="preserve"> Он с великим искусством истолковал «Бхагавата-самхиту»; его слава сияет в Кумарахатте, где он установил Кришнадеву</w:t>
-      </w:r>
-      <w:r>
-        <w:rPr>
-          <w:b w:val="0"/>
-          <w:i w:val="0"/>
-          <w:vertAlign w:val="superscript"/>
-        </w:rPr>
-        <w:t>53</w:t>
-      </w:r>
-      <w:r>
-        <w:t>.</w:t>
-      </w:r>
-    </w:p>
-    <w:p>
-      <w:pPr>
-        <w:spacing w:after="60"/>
-        <w:ind w:left="510" w:hanging="510"/>
-      </w:pPr>
-      <w:r>
-        <w:rPr>
-          <w:b/>
-          <w:i w:val="0"/>
-        </w:rPr>
-        <w:t>212.</w:t>
-      </w:r>
-      <w:r>
-        <w:t xml:space="preserve"> Пусть маханты, порядок упоминания которых нарушен, милостиво простят мне эту оплошность: даже Брахма, Шива и Шеша не в силах перечислить все достоинства святых.</w:t>
-      </w:r>
-    </w:p>
-    <w:p>
-      <w:pPr>
-        <w:spacing w:after="60"/>
-        <w:ind w:left="510" w:hanging="510"/>
-      </w:pPr>
-      <w:r>
-        <w:rPr>
-          <w:b/>
-          <w:i w:val="0"/>
-        </w:rPr>
-        <w:t>213.</w:t>
-      </w:r>
-      <w:r>
-        <w:t xml:space="preserve"> Эту книгу следует старательно скрывать от мимансаков, от лукавых спорщиков и особенно от тех, кто ищет одних доводов; её всегда следует давать знатокам шастр о расе, прибегшим к стопам Гауры.</w:t>
-      </w:r>
-    </w:p>
-    <w:p>
-      <w:pPr>
-        <w:spacing w:after="60"/>
-        <w:ind w:left="510" w:hanging="510"/>
-      </w:pPr>
-      <w:r>
-        <w:rPr>
-          <w:b/>
-          <w:i w:val="0"/>
-        </w:rPr>
-        <w:t>214.</w:t>
-      </w:r>
-      <w:r>
-        <w:t xml:space="preserve"> Эта «Шри Гаура-ганоддеша-дипика» составлена мной; да светит она в доме преданных, исполненном высшего блаженства</w:t>
-      </w:r>
-      <w:r>
-        <w:rPr>
-          <w:b w:val="0"/>
-          <w:i w:val="0"/>
-          <w:vertAlign w:val="superscript"/>
-        </w:rPr>
-        <w:t>54</w:t>
-      </w:r>
-      <w:r>
-        <w:t>.</w:t>
-      </w:r>
-    </w:p>
-    <w:p>
-      <w:pPr>
-        <w:spacing w:after="60"/>
-        <w:ind w:left="510" w:hanging="510"/>
-      </w:pPr>
-      <w:r>
-        <w:rPr>
-          <w:b/>
-          <w:i w:val="0"/>
-        </w:rPr>
-        <w:t>215.</w:t>
-      </w:r>
-      <w:r>
-        <w:t xml:space="preserve"> В году Шака, отмеренном числами «Васу», «Граха» и «Ману»</w:t>
-      </w:r>
-      <w:r>
-        <w:rPr>
-          <w:b w:val="0"/>
-          <w:i w:val="0"/>
-          <w:vertAlign w:val="superscript"/>
-        </w:rPr>
-        <w:t>55</w:t>
-      </w:r>
-      <w:r>
-        <w:t>, в некий день явилась эта книга. Пусть мудрые, чьи сердца погружены в нектар деяний Чайтанья-чандры, исправят её — это перечисление спутников Гауры.</w:t>
-      </w:r>
-    </w:p>
-    <w:p>
-      <w:pPr>
-        <w:spacing w:after="60"/>
-        <w:jc w:val="both"/>
-      </w:pPr>
-      <w:r>
-        <w:rPr>
-          <w:b w:val="0"/>
-          <w:i/>
-        </w:rPr>
-        <w:t>Так заканчивается «Шри Гаура-ганоддеша-дипика», составленная Кави Карнапурой, называемым также Пуридасом и Парамананда Дасом.</w:t>
-      </w:r>
-    </w:p>
-    <w:p>
-      <w:pPr>
-        <w:pStyle w:val="Heading3"/>
-      </w:pPr>
-      <w:r>
-        <w:t>Примечания переводчика</w:t>
-      </w:r>
-    </w:p>
-    <w:p>
-      <w:pPr>
-        <w:spacing w:after="60"/>
-        <w:ind w:left="283"/>
-      </w:pPr>
-      <w:r>
-        <w:rPr>
-          <w:b/>
-          <w:i w:val="0"/>
           <w:sz w:val="18"/>
         </w:rPr>
-        <w:t>39.</w:t>
+        <w:t>53.</w:t>
       </w:r>
       <w:r>
         <w:rPr>
           <w:sz w:val="18"/>
         </w:rPr>
-        <w:t xml:space="preserve"> То есть в Рамананде соединились трое: друг-наперсник Арджуна, Арджуна-Пандава и гопи Арджуния (Лалита, по мнению некоторых).</w:t>
-      </w:r>
-    </w:p>
-    <w:p>
-      <w:pPr>
-        <w:spacing w:after="60"/>
-        <w:ind w:left="283"/>
-      </w:pPr>
-      <w:r>
-        <w:rPr>
-          <w:b/>
-          <w:i w:val="0"/>
-          <w:sz w:val="18"/>
-        </w:rPr>
-        <w:t>40.</w:t>
-      </w:r>
-      <w:r>
-        <w:rPr>
-          <w:sz w:val="18"/>
-        </w:rPr>
-        <w:t xml:space="preserve"> Сундарананда Тхакур.</w:t>
-      </w:r>
-    </w:p>
-    <w:p>
-      <w:pPr>
-        <w:spacing w:after="60"/>
-        <w:ind w:left="283"/>
-      </w:pPr>
-      <w:r>
-        <w:rPr>
-          <w:b/>
-          <w:i w:val="0"/>
-          <w:sz w:val="18"/>
-        </w:rPr>
-        <w:t>41.</w:t>
-      </w:r>
-      <w:r>
-        <w:rPr>
-          <w:sz w:val="18"/>
-        </w:rPr>
-        <w:t xml:space="preserve"> «Кхола-веча» — продавец банановой кожуры (утвари из банановых листьев), Шридхара из «Чайтанья-бхагаваты».</w:t>
-      </w:r>
-    </w:p>
-    <w:p>
-      <w:pPr>
-        <w:spacing w:after="60"/>
-        <w:ind w:left="283"/>
-      </w:pPr>
-      <w:r>
-        <w:rPr>
-          <w:b/>
-          <w:i w:val="0"/>
-          <w:sz w:val="18"/>
-        </w:rPr>
-        <w:t>42.</w:t>
-      </w:r>
-      <w:r>
-        <w:rPr>
-          <w:sz w:val="18"/>
-        </w:rPr>
-        <w:t xml:space="preserve"> Не путать с Харидасом Тхакуром.</w:t>
-      </w:r>
-    </w:p>
-    <w:p>
-      <w:pPr>
-        <w:spacing w:after="60"/>
-        <w:ind w:left="283"/>
-      </w:pPr>
-      <w:r>
-        <w:rPr>
-          <w:b/>
-          <w:i w:val="0"/>
-          <w:sz w:val="18"/>
-        </w:rPr>
-        <w:t>43.</w:t>
-      </w:r>
-      <w:r>
-        <w:rPr>
-          <w:sz w:val="18"/>
-        </w:rPr>
-        <w:t xml:space="preserve"> Чайтанья Дас и Рамадас — старшие братья автора, сыновья Шивананды Сена.</w:t>
-      </w:r>
-    </w:p>
-    <w:p>
-      <w:pPr>
-        <w:spacing w:after="60"/>
-        <w:ind w:left="283"/>
-      </w:pPr>
-      <w:r>
-        <w:rPr>
-          <w:b/>
-          <w:i w:val="0"/>
-          <w:sz w:val="18"/>
-        </w:rPr>
-        <w:t>44.</w:t>
-      </w:r>
-      <w:r>
-        <w:rPr>
-          <w:sz w:val="18"/>
-        </w:rPr>
-        <w:t xml:space="preserve"> Гададхара Дас.</w:t>
-      </w:r>
-    </w:p>
-    <w:p>
-      <w:pPr>
-        <w:spacing w:after="60"/>
-        <w:ind w:left="283"/>
-      </w:pPr>
-      <w:r>
-        <w:rPr>
-          <w:b/>
-          <w:i w:val="0"/>
-          <w:sz w:val="18"/>
-        </w:rPr>
-        <w:t>45.</w:t>
-      </w:r>
-      <w:r>
-        <w:rPr>
-          <w:sz w:val="18"/>
-        </w:rPr>
-        <w:t xml:space="preserve"> Чанди — по-видимому, второе имя Шайбьи.</w:t>
-      </w:r>
-    </w:p>
-    <w:p>
-      <w:pPr>
-        <w:spacing w:after="60"/>
-        <w:ind w:left="283"/>
-      </w:pPr>
-      <w:r>
-        <w:rPr>
-          <w:b/>
-          <w:i w:val="0"/>
-          <w:sz w:val="18"/>
-        </w:rPr>
-        <w:t>46.</w:t>
-      </w:r>
-      <w:r>
-        <w:rPr>
-          <w:sz w:val="18"/>
-        </w:rPr>
-        <w:t xml:space="preserve"> Строка в извлечённом тексте неполна; перевод по сохранившейся части.</w:t>
-      </w:r>
-    </w:p>
-    <w:p>
-      <w:pPr>
-        <w:spacing w:after="60"/>
-        <w:ind w:left="283"/>
-      </w:pPr>
-      <w:r>
-        <w:rPr>
-          <w:b/>
-          <w:i w:val="0"/>
-          <w:sz w:val="18"/>
-        </w:rPr>
-        <w:t>47.</w:t>
-      </w:r>
-      <w:r>
-        <w:rPr>
-          <w:sz w:val="18"/>
-        </w:rPr>
-        <w:t xml:space="preserve"> Место повреждено в извлечённом тексте; соответствия восстановлены предположительно.</w:t>
-      </w:r>
-    </w:p>
-    <w:p>
-      <w:pPr>
-        <w:spacing w:after="60"/>
-        <w:ind w:left="283"/>
-      </w:pPr>
-      <w:r>
-        <w:rPr>
-          <w:b/>
-          <w:i w:val="0"/>
-          <w:sz w:val="18"/>
-        </w:rPr>
-        <w:t>48.</w:t>
-      </w:r>
-      <w:r>
-        <w:rPr>
-          <w:sz w:val="18"/>
-        </w:rPr>
-        <w:t xml:space="preserve"> Вамшивадана Тхакур — по традиции, воплощение флейты Кришны.</w:t>
-      </w:r>
-    </w:p>
-    <w:p>
-      <w:pPr>
-        <w:spacing w:after="60"/>
-        <w:ind w:left="283"/>
-      </w:pPr>
-      <w:r>
-        <w:rPr>
-          <w:b/>
-          <w:i w:val="0"/>
-          <w:sz w:val="18"/>
-        </w:rPr>
-        <w:t>49.</w:t>
-      </w:r>
-      <w:r>
-        <w:rPr>
-          <w:sz w:val="18"/>
-        </w:rPr>
-        <w:t xml:space="preserve"> Первая строка шлоки в извлечённом тексте отсутствует; второй «Санатана» — мудрец Санатана-кумара.</w:t>
-      </w:r>
-    </w:p>
-    <w:p>
-      <w:pPr>
-        <w:spacing w:after="60"/>
-        <w:ind w:left="283"/>
-      </w:pPr>
-      <w:r>
-        <w:rPr>
-          <w:b/>
-          <w:i w:val="0"/>
-          <w:sz w:val="18"/>
-        </w:rPr>
-        <w:t>50.</w:t>
-      </w:r>
-      <w:r>
-        <w:rPr>
-          <w:sz w:val="18"/>
-        </w:rPr>
-        <w:t xml:space="preserve"> Говинда, Мадхава и Васудева Гхош — братья-киртании.</w:t>
-      </w:r>
-    </w:p>
-    <w:p>
-      <w:pPr>
-        <w:spacing w:after="60"/>
-        <w:ind w:left="283"/>
-      </w:pPr>
-      <w:r>
-        <w:rPr>
-          <w:b/>
-          <w:i w:val="0"/>
-          <w:sz w:val="18"/>
-        </w:rPr>
-        <w:t>51.</w:t>
-      </w:r>
-      <w:r>
-        <w:rPr>
-          <w:sz w:val="18"/>
-        </w:rPr>
-        <w:t xml:space="preserve"> Начало шлоки в извлечённом тексте отсутствует. Калидас — дядя Рагхунатхи Даса, известный тем, что собирал остатки пищи у всех вайшнавов.</w:t>
-      </w:r>
-    </w:p>
-    <w:p>
-      <w:pPr>
-        <w:spacing w:after="60"/>
-        <w:ind w:left="283"/>
-      </w:pPr>
-      <w:r>
-        <w:rPr>
-          <w:b/>
-          <w:i w:val="0"/>
-          <w:sz w:val="18"/>
-        </w:rPr>
-        <w:t>52.</w:t>
-      </w:r>
-      <w:r>
-        <w:rPr>
-          <w:sz w:val="18"/>
-        </w:rPr>
-        <w:t xml:space="preserve"> Издание объединяет шлоки 194–207 в одну группу; соответствие имён гопи и спутников Гауры дано по порядку перечисления.</w:t>
-      </w:r>
-    </w:p>
-    <w:p>
-      <w:pPr>
-        <w:spacing w:after="60"/>
-        <w:ind w:left="283"/>
-      </w:pPr>
-      <w:r>
-        <w:rPr>
-          <w:b/>
-          <w:i w:val="0"/>
-          <w:sz w:val="18"/>
-        </w:rPr>
-        <w:t>53.</w:t>
-      </w:r>
-      <w:r>
-        <w:rPr>
-          <w:sz w:val="18"/>
-        </w:rPr>
         <w:t xml:space="preserve"> Шринатха Пандит, гуру автора, написал комментарий к «Бхагавате» «Чайтанья-мата-манджуша» и установил божество Кришнадевы в Кумарахатте.</w:t>
-      </w:r>
-    </w:p>
-    <w:p>
-      <w:pPr>
-        <w:spacing w:after="60"/>
-        <w:ind w:left="283"/>
-      </w:pPr>
-      <w:r>
-        <w:rPr>
-          <w:b/>
-          <w:i w:val="0"/>
-          <w:sz w:val="18"/>
-        </w:rPr>
-        <w:t>54.</w:t>
-      </w:r>
-      <w:r>
-        <w:rPr>
-          <w:sz w:val="18"/>
-        </w:rPr>
-        <w:t xml:space="preserve"> Начальные слова шлоки восстановлены по сохранившемуся тексту.</w:t>
       </w:r>
     </w:p>
     <w:p>

</xml_diff>